<commit_message>
Deploy preview for PR 78 🛫
</commit_message>
<xml_diff>
--- a/pr-preview/pr-78/chapters/01-introduction-tracked-changes.docx
+++ b/pr-preview/pr-78/chapters/01-introduction-tracked-changes.docx
@@ -69,7 +69,7 @@
         <w:t xml:space="preserve">.</w:t>
       </w:r>
     </w:p>
-    <w:bookmarkStart w:id="13" w:name="individual-causal-effects-pp.-3-4"/>
+    <w:bookmarkStart w:id="14" w:name="individual-causal-effects-pp.-3-4"/>
     <w:p>
       <w:pPr>
         <w:pStyle w:val="Heading2"/>
@@ -723,7 +723,7 @@
         <w:t xml:space="preserve">. This framework was formally developed in the statistical literature and is fundamental to causal inference.</w:t>
       </w:r>
     </w:p>
-    <w:bookmarkStart w:id="12" w:name="the-fundamental-problem"/>
+    <w:bookmarkStart w:id="13" w:name="the-fundamental-problem"/>
     <w:p>
       <w:pPr>
         <w:pStyle w:val="Heading3"/>
@@ -732,16 +732,93 @@
         <w:t xml:space="preserve">1.1 The Fundamental Problem</w:t>
       </w:r>
     </w:p>
-    <w:p>
-      <w:pPr>
-        <w:pStyle w:val="FirstParagraph"/>
-      </w:pPr>
-      <w:r>
-        <w:t xml:space="preserve">The fundamental problem of causal inference is that we can only observe one of the two counterfactual outcomes for each individual. If Zeus receives a heart transplant, we observe</w:t>
-      </w:r>
-      <w:r>
-        <w:t xml:space="preserve"> </w:t>
-      </w:r>
+    <w:tbl>
+      <w:tblPr>
+        <w:tblStyle w:val="Table"/>
+        <w:tblInd w:w="164" w:type="dxa"/>
+        <w:tblBorders>
+          <w:left w:val="single" w:sz="24" w:space="0" w:color="909090"/>
+        </w:tblBorders>
+        <w:tblCellMar>
+          <w:left w:w="0" w:type="dxa"/>
+          <w:right w:w="0" w:type="dxa"/>
+        </w:tblCellMar>
+        <w:tblLook w:firstRow="0" w:lastRow="0" w:firstColumn="0" w:lastColumn="0" w:noHBand="0" w:noVBand="0" w:val="0000"/>
+      </w:tblPr>
+      <w:tblGrid>
+        <w:gridCol w:w="7920"/>
+      </w:tblGrid>
+      <w:tr>
+        <w:trPr>
+          <w:cantSplit/>
+        </w:trPr>
+        <w:tc>
+          <w:tcPr>
+            <w:tcMar>
+              <w:left w:w="144" w:type="dxa"/>
+            </w:tcMar>
+          </w:tcPr>
+          <w:p>
+            <w:pPr>
+              <w:pStyle w:val="FirstParagraph"/>
+            </w:pPr>
+            <w:pPr>
+              <w:spacing w:before="16" w:after="64"/>
+            </w:pPr>
+          </w:p>
+          <w:bookmarkStart w:id="11" w:name="def-fundamental-problem"/>
+          <w:p>
+            <w:pPr>
+              <w:pStyle w:val="BodyText"/>
+            </w:pPr>
+            <w:r>
+              <w:rPr>
+                <w:b/>
+                <w:bCs/>
+              </w:rPr>
+              <w:t xml:space="preserve">Definition 3 (The Fundamental Problem of Causal Inference)</w:t>
+            </w:r>
+            <w:r>
+              <w:t xml:space="preserve"> </w:t>
+            </w:r>
+            <w:r>
+              <w:t xml:space="preserve">The</w:t>
+            </w:r>
+            <w:r>
+              <w:t xml:space="preserve"> </w:t>
+            </w:r>
+            <w:r>
+              <w:rPr>
+                <w:b/>
+                <w:bCs/>
+              </w:rPr>
+              <w:t xml:space="preserve">fundamental problem of causal inference</w:t>
+            </w:r>
+            <w:r>
+              <w:t xml:space="preserve"> </w:t>
+            </w:r>
+            <w:r>
+              <w:t xml:space="preserve">is that we can only observe one of the two counterfactual outcomes for each individual.</w:t>
+            </w:r>
+          </w:p>
+          <w:bookmarkEnd w:id="11"/>
+        </w:tc>
+      </w:tr>
+    </w:tbl>
+    <w:p>
+      <w:pPr>
+        <w:pStyle w:val="BodyText"/>
+      </w:pPr>
+      <w:ins w:id="15" w:author="PR Preview" w:date="2024-01-01T00:00:00Z">
+        <w:r>
+          <w:t xml:space="preserve">If Zeus receives a heart transplant, we observe</w:t>
+        </w:r>
+      </w:ins>
+      <w:ins w:id="15" w:author="PR Preview" w:date="2024-01-01T00:00:00Z">
+        <w:r>
+          <w:t xml:space="preserve"> </w:t>
+        </w:r>
+      </w:ins>
       <m:oMath>
         <m:sSup>
           <m:e>
@@ -765,15 +842,21 @@
           </m:sup>
         </m:sSup>
       </m:oMath>
-      <w:r>
-        <w:t xml:space="preserve"> </w:t>
-      </w:r>
-      <w:r>
-        <w:t xml:space="preserve">but not</w:t>
-      </w:r>
-      <w:r>
-        <w:t xml:space="preserve"> </w:t>
-      </w:r>
+      <w:ins w:id="15" w:author="PR Preview" w:date="2024-01-01T00:00:00Z">
+        <w:r>
+          <w:t xml:space="preserve"> </w:t>
+        </w:r>
+      </w:ins>
+      <w:ins w:id="15" w:author="PR Preview" w:date="2024-01-01T00:00:00Z">
+        <w:r>
+          <w:t xml:space="preserve">but not</w:t>
+        </w:r>
+      </w:ins>
+      <w:ins w:id="15" w:author="PR Preview" w:date="2024-01-01T00:00:00Z">
+        <w:r>
+          <w:t xml:space="preserve"> </w:t>
+        </w:r>
+      </w:ins>
       <m:oMath>
         <m:sSup>
           <m:e>
@@ -797,9 +880,11 @@
           </m:sup>
         </m:sSup>
       </m:oMath>
-      <w:r>
-        <w:t xml:space="preserve">. The unobserved counterfactual outcome remains unknown.</w:t>
-      </w:r>
+      <w:ins w:id="15" w:author="PR Preview" w:date="2024-01-01T00:00:00Z">
+        <w:r>
+          <w:t xml:space="preserve">. The unobserved counterfactual outcome remains unknown.</w:t>
+        </w:r>
+      </w:ins>
     </w:p>
     <w:tbl>
       <w:tblPr>
@@ -835,7 +920,7 @@
               <w:spacing w:before="16" w:after="64"/>
             </w:pPr>
           </w:p>
-          <w:bookmarkStart w:id="11" w:name="def-consistency-ch1"/>
+          <w:bookmarkStart w:id="12" w:name="def-consistency-ch1"/>
           <w:p>
             <w:pPr>
               <w:pStyle w:val="BodyText"/>
@@ -845,7 +930,7 @@
                 <w:b/>
                 <w:bCs/>
               </w:rPr>
-              <w:t xml:space="preserve">Definition 3 (Consistency)</w:t>
+              <w:t xml:space="preserve">Definition 4 (Consistency)</w:t>
             </w:r>
             <w:r>
               <w:t xml:space="preserve"> </w:t>
@@ -951,7 +1036,7 @@
               <w:t xml:space="preserve">.</w:t>
             </w:r>
           </w:p>
-          <w:bookmarkEnd w:id="11"/>
+          <w:bookmarkEnd w:id="12"/>
         </w:tc>
       </w:tr>
     </w:tbl>
@@ -1051,9 +1136,9 @@
         <w:t xml:space="preserve">in populations, which is the focus of the next section.</w:t>
       </w:r>
     </w:p>
-    <w:bookmarkEnd w:id="12"/>
     <w:bookmarkEnd w:id="13"/>
-    <w:bookmarkStart w:id="15" w:name="average-causal-effects-pp.-4-7"/>
+    <w:bookmarkEnd w:id="14"/>
+    <w:bookmarkStart w:id="18" w:name="average-causal-effects-pp.-4-7"/>
     <w:p>
       <w:pPr>
         <w:pStyle w:val="Heading2"/>
@@ -1319,7 +1404,7 @@
               <w:spacing w:before="16" w:after="64"/>
             </w:pPr>
           </w:p>
-          <w:bookmarkStart w:id="14" w:name="def-average-causal-effect"/>
+          <w:bookmarkStart w:id="15" w:name="def-average-causal-effect"/>
           <w:p>
             <w:pPr>
               <w:pStyle w:val="BodyText"/>
@@ -1329,7 +1414,7 @@
                 <w:b/>
                 <w:bCs/>
               </w:rPr>
-              <w:t xml:space="preserve">Definition 4 (Average Causal Effect)</w:t>
+              <w:t xml:space="preserve">Definition 5 (Average Causal Effect)</w:t>
             </w:r>
             <w:r>
               <w:t xml:space="preserve"> </w:t>
@@ -1598,7 +1683,7 @@
               </m:oMath>
             </m:oMathPara>
           </w:p>
-          <w:bookmarkEnd w:id="14"/>
+          <w:bookmarkEnd w:id="15"/>
         </w:tc>
       </w:tr>
     </w:tbl>
@@ -1606,490 +1691,35 @@
       <w:pPr>
         <w:pStyle w:val="FirstParagraph"/>
       </w:pPr>
-      <w:r>
-        <w:t xml:space="preserve">In our population, treatment does</w:t>
-      </w:r>
-      <w:r>
-        <w:t xml:space="preserve"> </w:t>
-      </w:r>
-      <w:r>
-        <w:rPr>
-          <w:i/>
-          <w:iCs/>
-        </w:rPr>
-        <w:t xml:space="preserve">not</w:t>
-      </w:r>
-      <w:r>
-        <w:t xml:space="preserve"> </w:t>
-      </w:r>
-      <w:r>
-        <w:t xml:space="preserve">have an average causal effect because both risks equal 0.5. The</w:t>
-      </w:r>
-      <w:r>
-        <w:t xml:space="preserve"> </w:t>
-      </w:r>
-      <w:r>
-        <w:rPr>
-          <w:b/>
-          <w:bCs/>
-        </w:rPr>
-        <w:t xml:space="preserve">null hypothesis of no average causal effect</w:t>
-      </w:r>
-      <w:r>
-        <w:t xml:space="preserve"> </w:t>
-      </w:r>
-      <w:r>
-        <w:t xml:space="preserve">holds. However, this does not mean there are no individual effects.</w:t>
-      </w:r>
-    </w:p>
-    <w:p>
-      <w:pPr>
-        <w:pStyle w:val="BodyText"/>
-      </w:pPr>
-      <w:r>
-        <w:t xml:space="preserve">Even though the average causal effect is null, 12 individuals in Table 1.1 have individual causal effects. Six were harmed by treatment (</w:t>
-      </w:r>
-      <m:oMath>
-        <m:sSup>
-          <m:e>
-            <m:r>
-              <m:t>Y</m:t>
-            </m:r>
-          </m:e>
-          <m:sup>
-            <m:r>
-              <m:t>a</m:t>
-            </m:r>
-            <m:r>
-              <m:rPr>
-                <m:sty m:val="p"/>
-              </m:rPr>
-              <m:t>=</m:t>
-            </m:r>
-            <m:r>
-              <m:t>1</m:t>
-            </m:r>
-          </m:sup>
-        </m:sSup>
-        <m:r>
-          <m:rPr>
-            <m:sty m:val="p"/>
-          </m:rPr>
-          <m:t>−</m:t>
-        </m:r>
-        <m:sSup>
-          <m:e>
-            <m:r>
-              <m:t>Y</m:t>
-            </m:r>
-          </m:e>
-          <m:sup>
-            <m:r>
-              <m:t>a</m:t>
-            </m:r>
-            <m:r>
-              <m:rPr>
-                <m:sty m:val="p"/>
-              </m:rPr>
-              <m:t>=</m:t>
-            </m:r>
-            <m:r>
-              <m:t>0</m:t>
-            </m:r>
-          </m:sup>
-        </m:sSup>
-        <m:r>
-          <m:rPr>
-            <m:sty m:val="p"/>
-          </m:rPr>
-          <m:t>=</m:t>
-        </m:r>
-        <m:r>
-          <m:t>1</m:t>
-        </m:r>
-      </m:oMath>
-      <w:r>
-        <w:t xml:space="preserve">), including Zeus, and six were helped (</w:t>
-      </w:r>
-      <m:oMath>
-        <m:sSup>
-          <m:e>
-            <m:r>
-              <m:t>Y</m:t>
-            </m:r>
-          </m:e>
-          <m:sup>
-            <m:r>
-              <m:t>a</m:t>
-            </m:r>
-            <m:r>
-              <m:rPr>
-                <m:sty m:val="p"/>
-              </m:rPr>
-              <m:t>=</m:t>
-            </m:r>
-            <m:r>
-              <m:t>1</m:t>
-            </m:r>
-          </m:sup>
-        </m:sSup>
-        <m:r>
-          <m:rPr>
-            <m:sty m:val="p"/>
-          </m:rPr>
-          <m:t>−</m:t>
-        </m:r>
-        <m:sSup>
-          <m:e>
-            <m:r>
-              <m:t>Y</m:t>
-            </m:r>
-          </m:e>
-          <m:sup>
-            <m:r>
-              <m:t>a</m:t>
-            </m:r>
-            <m:r>
-              <m:rPr>
-                <m:sty m:val="p"/>
-              </m:rPr>
-              <m:t>=</m:t>
-            </m:r>
-            <m:r>
-              <m:t>0</m:t>
-            </m:r>
-          </m:sup>
-        </m:sSup>
-        <m:r>
-          <m:rPr>
-            <m:sty m:val="p"/>
-          </m:rPr>
-          <m:t>=</m:t>
-        </m:r>
-        <m:r>
-          <m:rPr>
-            <m:sty m:val="p"/>
-          </m:rPr>
-          <m:t>−</m:t>
-        </m:r>
-        <m:r>
-          <m:t>1</m:t>
-        </m:r>
-      </m:oMath>
-      <w:r>
-        <w:t xml:space="preserve">). The harmful and beneficial effects cancel out in the average.</w:t>
-      </w:r>
-    </w:p>
-    <w:p>
-      <w:pPr>
-        <w:pStyle w:val="BodyText"/>
-      </w:pPr>
-      <w:r>
-        <w:t xml:space="preserve">The average causal effect</w:t>
-      </w:r>
-      <w:r>
-        <w:t xml:space="preserve"> </w:t>
-      </w:r>
-      <m:oMath>
-        <m:r>
-          <m:rPr>
-            <m:nor/>
-            <m:sty m:val="p"/>
-          </m:rPr>
-          <m:t>E</m:t>
-        </m:r>
-        <m:d>
-          <m:dPr>
-            <m:begChr m:val="["/>
-            <m:sepChr m:val=""/>
-            <m:endChr m:val="]"/>
-            <m:grow/>
-          </m:dPr>
-          <m:e>
-            <m:sSup>
-              <m:e>
-                <m:r>
-                  <m:t>Y</m:t>
-                </m:r>
-              </m:e>
-              <m:sup>
-                <m:r>
-                  <m:t>a</m:t>
-                </m:r>
-                <m:r>
-                  <m:rPr>
-                    <m:sty m:val="p"/>
-                  </m:rPr>
-                  <m:t>=</m:t>
-                </m:r>
-                <m:r>
-                  <m:t>1</m:t>
-                </m:r>
-              </m:sup>
-            </m:sSup>
-          </m:e>
-        </m:d>
-        <m:r>
-          <m:rPr>
-            <m:sty m:val="p"/>
-          </m:rPr>
-          <m:t>−</m:t>
-        </m:r>
-        <m:r>
-          <m:rPr>
-            <m:nor/>
-            <m:sty m:val="p"/>
-          </m:rPr>
-          <m:t>E</m:t>
-        </m:r>
-        <m:d>
-          <m:dPr>
-            <m:begChr m:val="["/>
-            <m:sepChr m:val=""/>
-            <m:endChr m:val="]"/>
-            <m:grow/>
-          </m:dPr>
-          <m:e>
-            <m:sSup>
-              <m:e>
-                <m:r>
-                  <m:t>Y</m:t>
-                </m:r>
-              </m:e>
-              <m:sup>
-                <m:r>
-                  <m:t>a</m:t>
-                </m:r>
-                <m:r>
-                  <m:rPr>
-                    <m:sty m:val="p"/>
-                  </m:rPr>
-                  <m:t>=</m:t>
-                </m:r>
-                <m:r>
-                  <m:t>0</m:t>
-                </m:r>
-              </m:sup>
-            </m:sSup>
-          </m:e>
-        </m:d>
-      </m:oMath>
-      <w:r>
-        <w:t xml:space="preserve"> </w:t>
-      </w:r>
-      <w:r>
-        <w:t xml:space="preserve">always equals the average of individual causal effects</w:t>
-      </w:r>
-      <w:r>
-        <w:t xml:space="preserve"> </w:t>
-      </w:r>
-      <m:oMath>
-        <m:r>
-          <m:rPr>
-            <m:nor/>
-            <m:sty m:val="p"/>
-          </m:rPr>
-          <m:t>E</m:t>
-        </m:r>
-        <m:d>
-          <m:dPr>
-            <m:begChr m:val="["/>
-            <m:sepChr m:val=""/>
-            <m:endChr m:val="]"/>
-            <m:grow/>
-          </m:dPr>
-          <m:e>
-            <m:sSup>
-              <m:e>
-                <m:r>
-                  <m:t>Y</m:t>
-                </m:r>
-              </m:e>
-              <m:sup>
-                <m:r>
-                  <m:t>a</m:t>
-                </m:r>
-                <m:r>
-                  <m:rPr>
-                    <m:sty m:val="p"/>
-                  </m:rPr>
-                  <m:t>=</m:t>
-                </m:r>
-                <m:r>
-                  <m:t>1</m:t>
-                </m:r>
-              </m:sup>
-            </m:sSup>
-            <m:r>
-              <m:rPr>
-                <m:sty m:val="p"/>
-              </m:rPr>
-              <m:t>−</m:t>
-            </m:r>
-            <m:sSup>
-              <m:e>
-                <m:r>
-                  <m:t>Y</m:t>
-                </m:r>
-              </m:e>
-              <m:sup>
-                <m:r>
-                  <m:t>a</m:t>
-                </m:r>
-                <m:r>
-                  <m:rPr>
-                    <m:sty m:val="p"/>
-                  </m:rPr>
-                  <m:t>=</m:t>
-                </m:r>
-                <m:r>
-                  <m:t>0</m:t>
-                </m:r>
-              </m:sup>
-            </m:sSup>
-          </m:e>
-        </m:d>
-      </m:oMath>
-      <w:r>
-        <w:t xml:space="preserve">, because a difference of averages equals the average of the differences.</w:t>
-      </w:r>
-    </w:p>
-    <w:p>
-      <w:pPr>
-        <w:pStyle w:val="BodyText"/>
-      </w:pPr>
-      <w:r>
-        <w:t xml:space="preserve">When there is no causal effect for</w:t>
-      </w:r>
-      <w:r>
-        <w:t xml:space="preserve"> </w:t>
-      </w:r>
-      <w:r>
-        <w:rPr>
-          <w:i/>
-          <w:iCs/>
-        </w:rPr>
-        <w:t xml:space="preserve">any</w:t>
-      </w:r>
-      <w:r>
-        <w:t xml:space="preserve"> </w:t>
-      </w:r>
-      <w:r>
-        <w:t xml:space="preserve">individual (i.e.,</w:t>
-      </w:r>
-      <w:r>
-        <w:t xml:space="preserve"> </w:t>
-      </w:r>
-      <m:oMath>
-        <m:sSup>
-          <m:e>
-            <m:r>
-              <m:t>Y</m:t>
-            </m:r>
-          </m:e>
-          <m:sup>
-            <m:r>
-              <m:t>a</m:t>
-            </m:r>
-            <m:r>
-              <m:rPr>
-                <m:sty m:val="p"/>
-              </m:rPr>
-              <m:t>=</m:t>
-            </m:r>
-            <m:r>
-              <m:t>1</m:t>
-            </m:r>
-          </m:sup>
-        </m:sSup>
-        <m:r>
-          <m:rPr>
-            <m:sty m:val="p"/>
-          </m:rPr>
-          <m:t>=</m:t>
-        </m:r>
-        <m:sSup>
-          <m:e>
-            <m:r>
-              <m:t>Y</m:t>
-            </m:r>
-          </m:e>
-          <m:sup>
-            <m:r>
-              <m:t>a</m:t>
-            </m:r>
-            <m:r>
-              <m:rPr>
-                <m:sty m:val="p"/>
-              </m:rPr>
-              <m:t>=</m:t>
-            </m:r>
-            <m:r>
-              <m:t>0</m:t>
-            </m:r>
-          </m:sup>
-        </m:sSup>
-      </m:oMath>
-      <w:r>
-        <w:t xml:space="preserve"> </w:t>
-      </w:r>
-      <w:r>
-        <w:t xml:space="preserve">for all individuals), we say the</w:t>
-      </w:r>
-      <w:r>
-        <w:t xml:space="preserve"> </w:t>
-      </w:r>
-      <w:r>
-        <w:rPr>
-          <w:b/>
-          <w:bCs/>
-        </w:rPr>
-        <w:t xml:space="preserve">sharp causal null hypothesis</w:t>
-      </w:r>
-      <w:r>
-        <w:t xml:space="preserve"> </w:t>
-      </w:r>
-      <w:r>
-        <w:t xml:space="preserve">is true. The sharp null implies the null hypothesis of no average effect.</w:t>
-      </w:r>
-    </w:p>
-    <w:bookmarkEnd w:id="15"/>
-    <w:bookmarkStart w:id="19" w:name="measures-of-causal-effect-pp.-7"/>
-    <w:p>
-      <w:pPr>
-        <w:pStyle w:val="Heading2"/>
-      </w:pPr>
-      <w:r>
-        <w:t xml:space="preserve">3 1.3 Measures of Causal Effect (pp. 7)</w:t>
-      </w:r>
-    </w:p>
-    <w:p>
-      <w:r>
-        <w:pict>
-          <v:rect style="width:0;height:1.5pt" o:hralign="center" o:hrstd="t" o:hr="t"/>
-        </w:pict>
-      </w:r>
-    </w:p>
-    <w:p>
-      <w:pPr>
-        <w:pStyle w:val="FirstParagraph"/>
-      </w:pPr>
-      <w:r>
-        <w:t xml:space="preserve">When a causal effect exists, we can quantify its magnitude using different</w:t>
-      </w:r>
-      <w:r>
-        <w:t xml:space="preserve"> </w:t>
-      </w:r>
-      <w:r>
-        <w:rPr>
-          <w:b/>
-          <w:bCs/>
-        </w:rPr>
-        <w:t xml:space="preserve">effect measures</w:t>
-      </w:r>
-      <w:r>
-        <w:t xml:space="preserve">. The three most common for binary outcomes are:</w:t>
-      </w:r>
+      <w:ins w:id="24" w:author="PR Preview" w:date="2024-01-01T00:00:00Z">
+        <w:r>
+          <w:t xml:space="preserve">In our population, treatment does</w:t>
+        </w:r>
+      </w:ins>
+      <w:ins w:id="24" w:author="PR Preview" w:date="2024-01-01T00:00:00Z">
+        <w:r>
+          <w:t xml:space="preserve"> </w:t>
+        </w:r>
+      </w:ins>
+      <w:ins w:id="24" w:author="PR Preview" w:date="2024-01-01T00:00:00Z">
+        <w:r>
+          <w:rPr>
+            <w:i/>
+            <w:iCs/>
+          </w:rPr>
+          <w:t xml:space="preserve">not</w:t>
+        </w:r>
+      </w:ins>
+      <w:ins w:id="24" w:author="PR Preview" w:date="2024-01-01T00:00:00Z">
+        <w:r>
+          <w:t xml:space="preserve"> </w:t>
+        </w:r>
+      </w:ins>
+      <w:ins w:id="24" w:author="PR Preview" w:date="2024-01-01T00:00:00Z">
+        <w:r>
+          <w:t xml:space="preserve">have an average causal effect because both risks equal 0.5. However, this does not mean there are no individual effects.</w:t>
+        </w:r>
+      </w:ins>
     </w:p>
     <w:tbl>
       <w:tblPr>
@@ -2125,7 +1755,7 @@
               <w:spacing w:before="16" w:after="64"/>
             </w:pPr>
           </w:p>
-          <w:bookmarkStart w:id="16" w:name="def-causal-risk-difference"/>
+          <w:bookmarkStart w:id="16" w:name="def-average-causal-null"/>
           <w:p>
             <w:pPr>
               <w:pStyle w:val="BodyText"/>
@@ -2135,122 +1765,243 @@
                 <w:b/>
                 <w:bCs/>
               </w:rPr>
-              <w:t xml:space="preserve">Definition 5 (Causal Risk Difference)</w:t>
-            </w:r>
-          </w:p>
-          <w:p>
-            <w:pPr>
-              <w:pStyle w:val="BodyText"/>
-            </w:pPr>
-            <m:oMathPara>
-              <m:oMathParaPr>
-                <m:jc m:val="center"/>
-              </m:oMathParaPr>
-              <m:oMath>
-                <m:r>
-                  <m:rPr>
-                    <m:sty m:val="p"/>
-                  </m:rPr>
-                  <m:t>Pr</m:t>
-                </m:r>
-                <m:r>
-                  <m:rPr>
-                    <m:sty m:val="p"/>
-                  </m:rPr>
-                  <m:t>[</m:t>
-                </m:r>
-                <m:sSup>
-                  <m:e>
-                    <m:r>
-                      <m:t>Y</m:t>
-                    </m:r>
-                  </m:e>
-                  <m:sup>
-                    <m:r>
-                      <m:t>a</m:t>
-                    </m:r>
-                    <m:r>
-                      <m:rPr>
-                        <m:sty m:val="p"/>
-                      </m:rPr>
-                      <m:t>=</m:t>
-                    </m:r>
-                    <m:r>
-                      <m:t>1</m:t>
-                    </m:r>
-                  </m:sup>
-                </m:sSup>
-                <m:r>
-                  <m:rPr>
-                    <m:sty m:val="p"/>
-                  </m:rPr>
-                  <m:t>=</m:t>
-                </m:r>
-                <m:r>
-                  <m:t>1</m:t>
-                </m:r>
-                <m:r>
-                  <m:rPr>
-                    <m:sty m:val="p"/>
-                  </m:rPr>
-                  <m:t>]</m:t>
-                </m:r>
-                <m:r>
-                  <m:rPr>
-                    <m:sty m:val="p"/>
-                  </m:rPr>
-                  <m:t>−</m:t>
-                </m:r>
-                <m:r>
-                  <m:rPr>
-                    <m:sty m:val="p"/>
-                  </m:rPr>
-                  <m:t>Pr</m:t>
-                </m:r>
-                <m:r>
-                  <m:rPr>
-                    <m:sty m:val="p"/>
-                  </m:rPr>
-                  <m:t>[</m:t>
-                </m:r>
-                <m:sSup>
-                  <m:e>
-                    <m:r>
-                      <m:t>Y</m:t>
-                    </m:r>
-                  </m:e>
-                  <m:sup>
-                    <m:r>
-                      <m:t>a</m:t>
-                    </m:r>
-                    <m:r>
-                      <m:rPr>
-                        <m:sty m:val="p"/>
-                      </m:rPr>
-                      <m:t>=</m:t>
-                    </m:r>
-                    <m:r>
-                      <m:t>0</m:t>
-                    </m:r>
-                  </m:sup>
-                </m:sSup>
-                <m:r>
-                  <m:rPr>
-                    <m:sty m:val="p"/>
-                  </m:rPr>
-                  <m:t>=</m:t>
-                </m:r>
-                <m:r>
-                  <m:t>1</m:t>
-                </m:r>
-                <m:r>
-                  <m:rPr>
-                    <m:sty m:val="p"/>
-                  </m:rPr>
-                  <m:t>]</m:t>
-                </m:r>
-              </m:oMath>
-            </m:oMathPara>
+              <w:t xml:space="preserve">Definition 6 (Null Hypothesis of No Average Causal Effect)</w:t>
+            </w:r>
+            <w:r>
+              <w:t xml:space="preserve"> </w:t>
+            </w:r>
+            <w:r>
+              <w:t xml:space="preserve">The</w:t>
+            </w:r>
+            <w:r>
+              <w:t xml:space="preserve"> </w:t>
+            </w:r>
+            <w:r>
+              <w:rPr>
+                <w:b/>
+                <w:bCs/>
+              </w:rPr>
+              <w:t xml:space="preserve">null hypothesis of no average causal effect</w:t>
+            </w:r>
+            <w:r>
+              <w:t xml:space="preserve"> </w:t>
+            </w:r>
+            <w:r>
+              <w:t xml:space="preserve">(also called the</w:t>
+            </w:r>
+            <w:r>
+              <w:t xml:space="preserve"> </w:t>
+            </w:r>
+            <w:r>
+              <w:rPr>
+                <w:b/>
+                <w:bCs/>
+              </w:rPr>
+              <w:t xml:space="preserve">average causal null hypothesis</w:t>
+            </w:r>
+            <w:r>
+              <w:t xml:space="preserve">) holds when</w:t>
+            </w:r>
+            <w:r>
+              <w:t xml:space="preserve"> </w:t>
+            </w:r>
+            <m:oMath>
+              <m:r>
+                <m:rPr>
+                  <m:sty m:val="p"/>
+                </m:rPr>
+                <m:t>Pr</m:t>
+              </m:r>
+              <m:r>
+                <m:rPr>
+                  <m:sty m:val="p"/>
+                </m:rPr>
+                <m:t>[</m:t>
+              </m:r>
+              <m:sSup>
+                <m:e>
+                  <m:r>
+                    <m:t>Y</m:t>
+                  </m:r>
+                </m:e>
+                <m:sup>
+                  <m:r>
+                    <m:t>a</m:t>
+                  </m:r>
+                  <m:r>
+                    <m:rPr>
+                      <m:sty m:val="p"/>
+                    </m:rPr>
+                    <m:t>=</m:t>
+                  </m:r>
+                  <m:r>
+                    <m:t>1</m:t>
+                  </m:r>
+                </m:sup>
+              </m:sSup>
+              <m:r>
+                <m:rPr>
+                  <m:sty m:val="p"/>
+                </m:rPr>
+                <m:t>=</m:t>
+              </m:r>
+              <m:r>
+                <m:t>1</m:t>
+              </m:r>
+              <m:r>
+                <m:rPr>
+                  <m:sty m:val="p"/>
+                </m:rPr>
+                <m:t>]</m:t>
+              </m:r>
+              <m:r>
+                <m:rPr>
+                  <m:sty m:val="p"/>
+                </m:rPr>
+                <m:t>=</m:t>
+              </m:r>
+              <m:r>
+                <m:rPr>
+                  <m:sty m:val="p"/>
+                </m:rPr>
+                <m:t>Pr</m:t>
+              </m:r>
+              <m:r>
+                <m:rPr>
+                  <m:sty m:val="p"/>
+                </m:rPr>
+                <m:t>[</m:t>
+              </m:r>
+              <m:sSup>
+                <m:e>
+                  <m:r>
+                    <m:t>Y</m:t>
+                  </m:r>
+                </m:e>
+                <m:sup>
+                  <m:r>
+                    <m:t>a</m:t>
+                  </m:r>
+                  <m:r>
+                    <m:rPr>
+                      <m:sty m:val="p"/>
+                    </m:rPr>
+                    <m:t>=</m:t>
+                  </m:r>
+                  <m:r>
+                    <m:t>0</m:t>
+                  </m:r>
+                </m:sup>
+              </m:sSup>
+              <m:r>
+                <m:rPr>
+                  <m:sty m:val="p"/>
+                </m:rPr>
+                <m:t>=</m:t>
+              </m:r>
+              <m:r>
+                <m:t>1</m:t>
+              </m:r>
+              <m:r>
+                <m:rPr>
+                  <m:sty m:val="p"/>
+                </m:rPr>
+                <m:t>]</m:t>
+              </m:r>
+            </m:oMath>
+            <w:r>
+              <w:t xml:space="preserve">, or equivalently</w:t>
+            </w:r>
+            <w:r>
+              <w:t xml:space="preserve"> </w:t>
+            </w:r>
+            <m:oMath>
+              <m:r>
+                <m:rPr>
+                  <m:nor/>
+                  <m:sty m:val="p"/>
+                </m:rPr>
+                <m:t>E</m:t>
+              </m:r>
+              <m:d>
+                <m:dPr>
+                  <m:begChr m:val="["/>
+                  <m:sepChr m:val=""/>
+                  <m:endChr m:val="]"/>
+                  <m:grow/>
+                </m:dPr>
+                <m:e>
+                  <m:sSup>
+                    <m:e>
+                      <m:r>
+                        <m:t>Y</m:t>
+                      </m:r>
+                    </m:e>
+                    <m:sup>
+                      <m:r>
+                        <m:t>a</m:t>
+                      </m:r>
+                      <m:r>
+                        <m:rPr>
+                          <m:sty m:val="p"/>
+                        </m:rPr>
+                        <m:t>=</m:t>
+                      </m:r>
+                      <m:r>
+                        <m:t>1</m:t>
+                      </m:r>
+                    </m:sup>
+                  </m:sSup>
+                </m:e>
+              </m:d>
+              <m:r>
+                <m:rPr>
+                  <m:sty m:val="p"/>
+                </m:rPr>
+                <m:t>=</m:t>
+              </m:r>
+              <m:r>
+                <m:rPr>
+                  <m:nor/>
+                  <m:sty m:val="p"/>
+                </m:rPr>
+                <m:t>E</m:t>
+              </m:r>
+              <m:d>
+                <m:dPr>
+                  <m:begChr m:val="["/>
+                  <m:sepChr m:val=""/>
+                  <m:endChr m:val="]"/>
+                  <m:grow/>
+                </m:dPr>
+                <m:e>
+                  <m:sSup>
+                    <m:e>
+                      <m:r>
+                        <m:t>Y</m:t>
+                      </m:r>
+                    </m:e>
+                    <m:sup>
+                      <m:r>
+                        <m:t>a</m:t>
+                      </m:r>
+                      <m:r>
+                        <m:rPr>
+                          <m:sty m:val="p"/>
+                        </m:rPr>
+                        <m:t>=</m:t>
+                      </m:r>
+                      <m:r>
+                        <m:t>0</m:t>
+                      </m:r>
+                    </m:sup>
+                  </m:sSup>
+                </m:e>
+              </m:d>
+            </m:oMath>
+            <w:r>
+              <w:t xml:space="preserve">.</w:t>
+            </w:r>
           </w:p>
           <w:bookmarkEnd w:id="16"/>
         </w:tc>
@@ -2258,10 +2009,314 @@
     </w:tbl>
     <w:p>
       <w:pPr>
-        <w:pStyle w:val="FirstParagraph"/>
-      </w:pPr>
-      <w:r>
-        <w:t xml:space="preserve">This additive measure equals zero under the null hypothesis. It measures the absolute difference in risk.</w:t>
+        <w:pStyle w:val="BodyText"/>
+      </w:pPr>
+      <w:r>
+        <w:t xml:space="preserve">Even though the average causal effect is null, 12 individuals in Table 1.1 have individual causal effects. Six were harmed by treatment (</w:t>
+      </w:r>
+      <m:oMath>
+        <m:sSup>
+          <m:e>
+            <m:r>
+              <m:t>Y</m:t>
+            </m:r>
+          </m:e>
+          <m:sup>
+            <m:r>
+              <m:t>a</m:t>
+            </m:r>
+            <m:r>
+              <m:rPr>
+                <m:sty m:val="p"/>
+              </m:rPr>
+              <m:t>=</m:t>
+            </m:r>
+            <m:r>
+              <m:t>1</m:t>
+            </m:r>
+          </m:sup>
+        </m:sSup>
+        <m:r>
+          <m:rPr>
+            <m:sty m:val="p"/>
+          </m:rPr>
+          <m:t>−</m:t>
+        </m:r>
+        <m:sSup>
+          <m:e>
+            <m:r>
+              <m:t>Y</m:t>
+            </m:r>
+          </m:e>
+          <m:sup>
+            <m:r>
+              <m:t>a</m:t>
+            </m:r>
+            <m:r>
+              <m:rPr>
+                <m:sty m:val="p"/>
+              </m:rPr>
+              <m:t>=</m:t>
+            </m:r>
+            <m:r>
+              <m:t>0</m:t>
+            </m:r>
+          </m:sup>
+        </m:sSup>
+        <m:r>
+          <m:rPr>
+            <m:sty m:val="p"/>
+          </m:rPr>
+          <m:t>=</m:t>
+        </m:r>
+        <m:r>
+          <m:t>1</m:t>
+        </m:r>
+      </m:oMath>
+      <w:r>
+        <w:t xml:space="preserve">), including Zeus, and six were helped (</w:t>
+      </w:r>
+      <m:oMath>
+        <m:sSup>
+          <m:e>
+            <m:r>
+              <m:t>Y</m:t>
+            </m:r>
+          </m:e>
+          <m:sup>
+            <m:r>
+              <m:t>a</m:t>
+            </m:r>
+            <m:r>
+              <m:rPr>
+                <m:sty m:val="p"/>
+              </m:rPr>
+              <m:t>=</m:t>
+            </m:r>
+            <m:r>
+              <m:t>1</m:t>
+            </m:r>
+          </m:sup>
+        </m:sSup>
+        <m:r>
+          <m:rPr>
+            <m:sty m:val="p"/>
+          </m:rPr>
+          <m:t>−</m:t>
+        </m:r>
+        <m:sSup>
+          <m:e>
+            <m:r>
+              <m:t>Y</m:t>
+            </m:r>
+          </m:e>
+          <m:sup>
+            <m:r>
+              <m:t>a</m:t>
+            </m:r>
+            <m:r>
+              <m:rPr>
+                <m:sty m:val="p"/>
+              </m:rPr>
+              <m:t>=</m:t>
+            </m:r>
+            <m:r>
+              <m:t>0</m:t>
+            </m:r>
+          </m:sup>
+        </m:sSup>
+        <m:r>
+          <m:rPr>
+            <m:sty m:val="p"/>
+          </m:rPr>
+          <m:t>=</m:t>
+        </m:r>
+        <m:r>
+          <m:rPr>
+            <m:sty m:val="p"/>
+          </m:rPr>
+          <m:t>−</m:t>
+        </m:r>
+        <m:r>
+          <m:t>1</m:t>
+        </m:r>
+      </m:oMath>
+      <w:r>
+        <w:t xml:space="preserve">). The harmful and beneficial effects cancel out in the average.</w:t>
+      </w:r>
+    </w:p>
+    <w:p>
+      <w:pPr>
+        <w:pStyle w:val="BodyText"/>
+      </w:pPr>
+      <w:r>
+        <w:t xml:space="preserve">The average causal effect</w:t>
+      </w:r>
+      <w:r>
+        <w:t xml:space="preserve"> </w:t>
+      </w:r>
+      <m:oMath>
+        <m:r>
+          <m:rPr>
+            <m:nor/>
+            <m:sty m:val="p"/>
+          </m:rPr>
+          <m:t>E</m:t>
+        </m:r>
+        <m:d>
+          <m:dPr>
+            <m:begChr m:val="["/>
+            <m:sepChr m:val=""/>
+            <m:endChr m:val="]"/>
+            <m:grow/>
+          </m:dPr>
+          <m:e>
+            <m:sSup>
+              <m:e>
+                <m:r>
+                  <m:t>Y</m:t>
+                </m:r>
+              </m:e>
+              <m:sup>
+                <m:r>
+                  <m:t>a</m:t>
+                </m:r>
+                <m:r>
+                  <m:rPr>
+                    <m:sty m:val="p"/>
+                  </m:rPr>
+                  <m:t>=</m:t>
+                </m:r>
+                <m:r>
+                  <m:t>1</m:t>
+                </m:r>
+              </m:sup>
+            </m:sSup>
+          </m:e>
+        </m:d>
+        <m:r>
+          <m:rPr>
+            <m:sty m:val="p"/>
+          </m:rPr>
+          <m:t>−</m:t>
+        </m:r>
+        <m:r>
+          <m:rPr>
+            <m:nor/>
+            <m:sty m:val="p"/>
+          </m:rPr>
+          <m:t>E</m:t>
+        </m:r>
+        <m:d>
+          <m:dPr>
+            <m:begChr m:val="["/>
+            <m:sepChr m:val=""/>
+            <m:endChr m:val="]"/>
+            <m:grow/>
+          </m:dPr>
+          <m:e>
+            <m:sSup>
+              <m:e>
+                <m:r>
+                  <m:t>Y</m:t>
+                </m:r>
+              </m:e>
+              <m:sup>
+                <m:r>
+                  <m:t>a</m:t>
+                </m:r>
+                <m:r>
+                  <m:rPr>
+                    <m:sty m:val="p"/>
+                  </m:rPr>
+                  <m:t>=</m:t>
+                </m:r>
+                <m:r>
+                  <m:t>0</m:t>
+                </m:r>
+              </m:sup>
+            </m:sSup>
+          </m:e>
+        </m:d>
+      </m:oMath>
+      <w:r>
+        <w:t xml:space="preserve"> </w:t>
+      </w:r>
+      <w:r>
+        <w:t xml:space="preserve">always equals the average of individual causal effects</w:t>
+      </w:r>
+      <w:r>
+        <w:t xml:space="preserve"> </w:t>
+      </w:r>
+      <m:oMath>
+        <m:r>
+          <m:rPr>
+            <m:nor/>
+            <m:sty m:val="p"/>
+          </m:rPr>
+          <m:t>E</m:t>
+        </m:r>
+        <m:d>
+          <m:dPr>
+            <m:begChr m:val="["/>
+            <m:sepChr m:val=""/>
+            <m:endChr m:val="]"/>
+            <m:grow/>
+          </m:dPr>
+          <m:e>
+            <m:sSup>
+              <m:e>
+                <m:r>
+                  <m:t>Y</m:t>
+                </m:r>
+              </m:e>
+              <m:sup>
+                <m:r>
+                  <m:t>a</m:t>
+                </m:r>
+                <m:r>
+                  <m:rPr>
+                    <m:sty m:val="p"/>
+                  </m:rPr>
+                  <m:t>=</m:t>
+                </m:r>
+                <m:r>
+                  <m:t>1</m:t>
+                </m:r>
+              </m:sup>
+            </m:sSup>
+            <m:r>
+              <m:rPr>
+                <m:sty m:val="p"/>
+              </m:rPr>
+              <m:t>−</m:t>
+            </m:r>
+            <m:sSup>
+              <m:e>
+                <m:r>
+                  <m:t>Y</m:t>
+                </m:r>
+              </m:e>
+              <m:sup>
+                <m:r>
+                  <m:t>a</m:t>
+                </m:r>
+                <m:r>
+                  <m:rPr>
+                    <m:sty m:val="p"/>
+                  </m:rPr>
+                  <m:t>=</m:t>
+                </m:r>
+                <m:r>
+                  <m:t>0</m:t>
+                </m:r>
+              </m:sup>
+            </m:sSup>
+          </m:e>
+        </m:d>
+      </m:oMath>
+      <w:r>
+        <w:t xml:space="preserve">, because a difference of averages equals the average of the differences.</w:t>
       </w:r>
     </w:p>
     <w:tbl>
@@ -2298,7 +2353,7 @@
               <w:spacing w:before="16" w:after="64"/>
             </w:pPr>
           </w:p>
-          <w:bookmarkStart w:id="17" w:name="def-causal-risk-ratio"/>
+          <w:bookmarkStart w:id="17" w:name="def-sharp-causal-null"/>
           <w:p>
             <w:pPr>
               <w:pStyle w:val="BodyText"/>
@@ -2308,136 +2363,146 @@
                 <w:b/>
                 <w:bCs/>
               </w:rPr>
-              <w:t xml:space="preserve">Definition 6 (Causal Risk Ratio)</w:t>
-            </w:r>
-          </w:p>
-          <w:p>
-            <w:pPr>
-              <w:pStyle w:val="BodyText"/>
-            </w:pPr>
-            <m:oMathPara>
-              <m:oMathParaPr>
-                <m:jc m:val="center"/>
-              </m:oMathParaPr>
-              <m:oMath>
-                <m:f>
-                  <m:fPr>
-                    <m:type m:val="bar"/>
-                  </m:fPr>
-                  <m:num>
-                    <m:r>
-                      <m:rPr>
-                        <m:sty m:val="p"/>
-                      </m:rPr>
-                      <m:t>Pr</m:t>
-                    </m:r>
-                    <m:r>
-                      <m:rPr>
-                        <m:sty m:val="p"/>
-                      </m:rPr>
-                      <m:t>[</m:t>
-                    </m:r>
-                    <m:sSup>
-                      <m:e>
-                        <m:r>
-                          <m:t>Y</m:t>
-                        </m:r>
-                      </m:e>
-                      <m:sup>
-                        <m:r>
-                          <m:t>a</m:t>
-                        </m:r>
-                        <m:r>
-                          <m:rPr>
-                            <m:sty m:val="p"/>
-                          </m:rPr>
-                          <m:t>=</m:t>
-                        </m:r>
-                        <m:r>
-                          <m:t>1</m:t>
-                        </m:r>
-                      </m:sup>
-                    </m:sSup>
-                    <m:r>
-                      <m:rPr>
-                        <m:sty m:val="p"/>
-                      </m:rPr>
-                      <m:t>=</m:t>
-                    </m:r>
-                    <m:r>
-                      <m:t>1</m:t>
-                    </m:r>
-                    <m:r>
-                      <m:rPr>
-                        <m:sty m:val="p"/>
-                      </m:rPr>
-                      <m:t>]</m:t>
-                    </m:r>
-                  </m:num>
-                  <m:den>
-                    <m:r>
-                      <m:rPr>
-                        <m:sty m:val="p"/>
-                      </m:rPr>
-                      <m:t>Pr</m:t>
-                    </m:r>
-                    <m:r>
-                      <m:rPr>
-                        <m:sty m:val="p"/>
-                      </m:rPr>
-                      <m:t>[</m:t>
-                    </m:r>
-                    <m:sSup>
-                      <m:e>
-                        <m:r>
-                          <m:t>Y</m:t>
-                        </m:r>
-                      </m:e>
-                      <m:sup>
-                        <m:r>
-                          <m:t>a</m:t>
-                        </m:r>
-                        <m:r>
-                          <m:rPr>
-                            <m:sty m:val="p"/>
-                          </m:rPr>
-                          <m:t>=</m:t>
-                        </m:r>
-                        <m:r>
-                          <m:t>0</m:t>
-                        </m:r>
-                      </m:sup>
-                    </m:sSup>
-                    <m:r>
-                      <m:rPr>
-                        <m:sty m:val="p"/>
-                      </m:rPr>
-                      <m:t>=</m:t>
-                    </m:r>
-                    <m:r>
-                      <m:t>1</m:t>
-                    </m:r>
-                    <m:r>
-                      <m:rPr>
-                        <m:sty m:val="p"/>
-                      </m:rPr>
-                      <m:t>]</m:t>
-                    </m:r>
-                  </m:den>
-                </m:f>
-              </m:oMath>
-            </m:oMathPara>
+              <w:t xml:space="preserve">Definition 7 (Sharp Causal Null Hypothesis)</w:t>
+            </w:r>
+            <w:r>
+              <w:t xml:space="preserve"> </w:t>
+            </w:r>
+            <w:r>
+              <w:t xml:space="preserve">The</w:t>
+            </w:r>
+            <w:r>
+              <w:t xml:space="preserve"> </w:t>
+            </w:r>
+            <w:r>
+              <w:rPr>
+                <w:b/>
+                <w:bCs/>
+              </w:rPr>
+              <w:t xml:space="preserve">sharp causal null hypothesis</w:t>
+            </w:r>
+            <w:r>
+              <w:t xml:space="preserve"> </w:t>
+            </w:r>
+            <w:r>
+              <w:t xml:space="preserve">holds when there is no causal effect for</w:t>
+            </w:r>
+            <w:r>
+              <w:t xml:space="preserve"> </w:t>
+            </w:r>
+            <w:r>
+              <w:rPr>
+                <w:i/>
+                <w:iCs/>
+              </w:rPr>
+              <w:t xml:space="preserve">any</w:t>
+            </w:r>
+            <w:r>
+              <w:t xml:space="preserve"> </w:t>
+            </w:r>
+            <w:r>
+              <w:t xml:space="preserve">individual, i.e.,</w:t>
+            </w:r>
+            <w:r>
+              <w:t xml:space="preserve"> </w:t>
+            </w:r>
+            <m:oMath>
+              <m:sSup>
+                <m:e>
+                  <m:r>
+                    <m:t>Y</m:t>
+                  </m:r>
+                </m:e>
+                <m:sup>
+                  <m:r>
+                    <m:t>a</m:t>
+                  </m:r>
+                  <m:r>
+                    <m:rPr>
+                      <m:sty m:val="p"/>
+                    </m:rPr>
+                    <m:t>=</m:t>
+                  </m:r>
+                  <m:r>
+                    <m:t>1</m:t>
+                  </m:r>
+                </m:sup>
+              </m:sSup>
+              <m:r>
+                <m:rPr>
+                  <m:sty m:val="p"/>
+                </m:rPr>
+                <m:t>=</m:t>
+              </m:r>
+              <m:sSup>
+                <m:e>
+                  <m:r>
+                    <m:t>Y</m:t>
+                  </m:r>
+                </m:e>
+                <m:sup>
+                  <m:r>
+                    <m:t>a</m:t>
+                  </m:r>
+                  <m:r>
+                    <m:rPr>
+                      <m:sty m:val="p"/>
+                    </m:rPr>
+                    <m:t>=</m:t>
+                  </m:r>
+                  <m:r>
+                    <m:t>0</m:t>
+                  </m:r>
+                </m:sup>
+              </m:sSup>
+            </m:oMath>
+            <w:r>
+              <w:t xml:space="preserve"> </w:t>
+            </w:r>
+            <w:r>
+              <w:t xml:space="preserve">for all individuals. The sharp null implies the null hypothesis of no average effect.</w:t>
+            </w:r>
           </w:p>
           <w:bookmarkEnd w:id="17"/>
         </w:tc>
       </w:tr>
     </w:tbl>
+    <w:bookmarkEnd w:id="18"/>
+    <w:bookmarkStart w:id="22" w:name="measures-of-causal-effect-pp.-7"/>
+    <w:p>
+      <w:pPr>
+        <w:pStyle w:val="Heading2"/>
+      </w:pPr>
+      <w:r>
+        <w:t xml:space="preserve">3 1.3 Measures of Causal Effect (pp. 7)</w:t>
+      </w:r>
+    </w:p>
+    <w:p>
+      <w:r>
+        <w:pict>
+          <v:rect style="width:0;height:1.5pt" o:hralign="center" o:hrstd="t" o:hr="t"/>
+        </w:pict>
+      </w:r>
+    </w:p>
     <w:p>
       <w:pPr>
         <w:pStyle w:val="FirstParagraph"/>
       </w:pPr>
       <w:r>
-        <w:t xml:space="preserve">This multiplicative measure equals one under the null hypothesis. It measures how many times treatment increases (or decreases) the risk.</w:t>
+        <w:t xml:space="preserve">When a causal effect exists, we can quantify its magnitude using different</w:t>
+      </w:r>
+      <w:r>
+        <w:t xml:space="preserve"> </w:t>
+      </w:r>
+      <w:r>
+        <w:rPr>
+          <w:b/>
+          <w:bCs/>
+        </w:rPr>
+        <w:t xml:space="preserve">effect measures</w:t>
+      </w:r>
+      <w:r>
+        <w:t xml:space="preserve">. The three most common for binary outcomes are:</w:t>
       </w:r>
     </w:p>
     <w:tbl>
@@ -2474,7 +2539,7 @@
               <w:spacing w:before="16" w:after="64"/>
             </w:pPr>
           </w:p>
-          <w:bookmarkStart w:id="18" w:name="def-causal-odds-ratio"/>
+          <w:bookmarkStart w:id="19" w:name="def-causal-risk-difference"/>
           <w:p>
             <w:pPr>
               <w:pStyle w:val="BodyText"/>
@@ -2484,7 +2549,180 @@
                 <w:b/>
                 <w:bCs/>
               </w:rPr>
-              <w:t xml:space="preserve">Definition 7 (Causal Odds Ratio)</w:t>
+              <w:t xml:space="preserve">Definition 8 (Causal Risk Difference)</w:t>
+            </w:r>
+          </w:p>
+          <w:p>
+            <w:pPr>
+              <w:pStyle w:val="BodyText"/>
+            </w:pPr>
+            <m:oMathPara>
+              <m:oMathParaPr>
+                <m:jc m:val="center"/>
+              </m:oMathParaPr>
+              <m:oMath>
+                <m:r>
+                  <m:rPr>
+                    <m:sty m:val="p"/>
+                  </m:rPr>
+                  <m:t>Pr</m:t>
+                </m:r>
+                <m:r>
+                  <m:rPr>
+                    <m:sty m:val="p"/>
+                  </m:rPr>
+                  <m:t>[</m:t>
+                </m:r>
+                <m:sSup>
+                  <m:e>
+                    <m:r>
+                      <m:t>Y</m:t>
+                    </m:r>
+                  </m:e>
+                  <m:sup>
+                    <m:r>
+                      <m:t>a</m:t>
+                    </m:r>
+                    <m:r>
+                      <m:rPr>
+                        <m:sty m:val="p"/>
+                      </m:rPr>
+                      <m:t>=</m:t>
+                    </m:r>
+                    <m:r>
+                      <m:t>1</m:t>
+                    </m:r>
+                  </m:sup>
+                </m:sSup>
+                <m:r>
+                  <m:rPr>
+                    <m:sty m:val="p"/>
+                  </m:rPr>
+                  <m:t>=</m:t>
+                </m:r>
+                <m:r>
+                  <m:t>1</m:t>
+                </m:r>
+                <m:r>
+                  <m:rPr>
+                    <m:sty m:val="p"/>
+                  </m:rPr>
+                  <m:t>]</m:t>
+                </m:r>
+                <m:r>
+                  <m:rPr>
+                    <m:sty m:val="p"/>
+                  </m:rPr>
+                  <m:t>−</m:t>
+                </m:r>
+                <m:r>
+                  <m:rPr>
+                    <m:sty m:val="p"/>
+                  </m:rPr>
+                  <m:t>Pr</m:t>
+                </m:r>
+                <m:r>
+                  <m:rPr>
+                    <m:sty m:val="p"/>
+                  </m:rPr>
+                  <m:t>[</m:t>
+                </m:r>
+                <m:sSup>
+                  <m:e>
+                    <m:r>
+                      <m:t>Y</m:t>
+                    </m:r>
+                  </m:e>
+                  <m:sup>
+                    <m:r>
+                      <m:t>a</m:t>
+                    </m:r>
+                    <m:r>
+                      <m:rPr>
+                        <m:sty m:val="p"/>
+                      </m:rPr>
+                      <m:t>=</m:t>
+                    </m:r>
+                    <m:r>
+                      <m:t>0</m:t>
+                    </m:r>
+                  </m:sup>
+                </m:sSup>
+                <m:r>
+                  <m:rPr>
+                    <m:sty m:val="p"/>
+                  </m:rPr>
+                  <m:t>=</m:t>
+                </m:r>
+                <m:r>
+                  <m:t>1</m:t>
+                </m:r>
+                <m:r>
+                  <m:rPr>
+                    <m:sty m:val="p"/>
+                  </m:rPr>
+                  <m:t>]</m:t>
+                </m:r>
+              </m:oMath>
+            </m:oMathPara>
+          </w:p>
+          <w:bookmarkEnd w:id="19"/>
+        </w:tc>
+      </w:tr>
+    </w:tbl>
+    <w:p>
+      <w:pPr>
+        <w:pStyle w:val="FirstParagraph"/>
+      </w:pPr>
+      <w:r>
+        <w:t xml:space="preserve">This additive measure equals zero under the null hypothesis. It measures the absolute difference in risk.</w:t>
+      </w:r>
+    </w:p>
+    <w:tbl>
+      <w:tblPr>
+        <w:tblStyle w:val="Table"/>
+        <w:tblInd w:w="164" w:type="dxa"/>
+        <w:tblBorders>
+          <w:left w:val="single" w:sz="24" w:space="0" w:color="909090"/>
+        </w:tblBorders>
+        <w:tblCellMar>
+          <w:left w:w="0" w:type="dxa"/>
+          <w:right w:w="0" w:type="dxa"/>
+        </w:tblCellMar>
+        <w:tblLook w:firstRow="0" w:lastRow="0" w:firstColumn="0" w:lastColumn="0" w:noHBand="0" w:noVBand="0" w:val="0000"/>
+      </w:tblPr>
+      <w:tblGrid>
+        <w:gridCol w:w="7920"/>
+      </w:tblGrid>
+      <w:tr>
+        <w:trPr>
+          <w:cantSplit/>
+        </w:trPr>
+        <w:tc>
+          <w:tcPr>
+            <w:tcMar>
+              <w:left w:w="144" w:type="dxa"/>
+            </w:tcMar>
+          </w:tcPr>
+          <w:p>
+            <w:pPr>
+              <w:pStyle w:val="BodyText"/>
+            </w:pPr>
+            <w:pPr>
+              <w:spacing w:before="16" w:after="64"/>
+            </w:pPr>
+          </w:p>
+          <w:bookmarkStart w:id="20" w:name="def-causal-risk-ratio"/>
+          <w:p>
+            <w:pPr>
+              <w:pStyle w:val="BodyText"/>
+            </w:pPr>
+            <w:r>
+              <w:rPr>
+                <w:b/>
+                <w:bCs/>
+              </w:rPr>
+              <w:t xml:space="preserve">Definition 9 (Causal Risk Ratio)</w:t>
             </w:r>
           </w:p>
           <w:p>
@@ -2549,12 +2787,134 @@
                       </m:rPr>
                       <m:t>]</m:t>
                     </m:r>
+                  </m:num>
+                  <m:den>
                     <m:r>
                       <m:rPr>
                         <m:sty m:val="p"/>
                       </m:rPr>
-                      <m:t>/</m:t>
-                    </m:r>
+                      <m:t>Pr</m:t>
+                    </m:r>
+                    <m:r>
+                      <m:rPr>
+                        <m:sty m:val="p"/>
+                      </m:rPr>
+                      <m:t>[</m:t>
+                    </m:r>
+                    <m:sSup>
+                      <m:e>
+                        <m:r>
+                          <m:t>Y</m:t>
+                        </m:r>
+                      </m:e>
+                      <m:sup>
+                        <m:r>
+                          <m:t>a</m:t>
+                        </m:r>
+                        <m:r>
+                          <m:rPr>
+                            <m:sty m:val="p"/>
+                          </m:rPr>
+                          <m:t>=</m:t>
+                        </m:r>
+                        <m:r>
+                          <m:t>0</m:t>
+                        </m:r>
+                      </m:sup>
+                    </m:sSup>
+                    <m:r>
+                      <m:rPr>
+                        <m:sty m:val="p"/>
+                      </m:rPr>
+                      <m:t>=</m:t>
+                    </m:r>
+                    <m:r>
+                      <m:t>1</m:t>
+                    </m:r>
+                    <m:r>
+                      <m:rPr>
+                        <m:sty m:val="p"/>
+                      </m:rPr>
+                      <m:t>]</m:t>
+                    </m:r>
+                  </m:den>
+                </m:f>
+              </m:oMath>
+            </m:oMathPara>
+          </w:p>
+          <w:bookmarkEnd w:id="20"/>
+        </w:tc>
+      </w:tr>
+    </w:tbl>
+    <w:p>
+      <w:pPr>
+        <w:pStyle w:val="FirstParagraph"/>
+      </w:pPr>
+      <w:r>
+        <w:t xml:space="preserve">This multiplicative measure equals one under the null hypothesis. It measures how many times treatment increases (or decreases) the risk.</w:t>
+      </w:r>
+    </w:p>
+    <w:tbl>
+      <w:tblPr>
+        <w:tblStyle w:val="Table"/>
+        <w:tblInd w:w="164" w:type="dxa"/>
+        <w:tblBorders>
+          <w:left w:val="single" w:sz="24" w:space="0" w:color="909090"/>
+        </w:tblBorders>
+        <w:tblCellMar>
+          <w:left w:w="0" w:type="dxa"/>
+          <w:right w:w="0" w:type="dxa"/>
+        </w:tblCellMar>
+        <w:tblLook w:firstRow="0" w:lastRow="0" w:firstColumn="0" w:lastColumn="0" w:noHBand="0" w:noVBand="0" w:val="0000"/>
+      </w:tblPr>
+      <w:tblGrid>
+        <w:gridCol w:w="7920"/>
+      </w:tblGrid>
+      <w:tr>
+        <w:trPr>
+          <w:cantSplit/>
+        </w:trPr>
+        <w:tc>
+          <w:tcPr>
+            <w:tcMar>
+              <w:left w:w="144" w:type="dxa"/>
+            </w:tcMar>
+          </w:tcPr>
+          <w:p>
+            <w:pPr>
+              <w:pStyle w:val="BodyText"/>
+            </w:pPr>
+            <w:pPr>
+              <w:spacing w:before="16" w:after="64"/>
+            </w:pPr>
+          </w:p>
+          <w:bookmarkStart w:id="21" w:name="def-causal-odds-ratio"/>
+          <w:p>
+            <w:pPr>
+              <w:pStyle w:val="BodyText"/>
+            </w:pPr>
+            <w:r>
+              <w:rPr>
+                <w:b/>
+                <w:bCs/>
+              </w:rPr>
+              <w:t xml:space="preserve">Definition 10 (Causal Odds Ratio)</w:t>
+            </w:r>
+          </w:p>
+          <w:p>
+            <w:pPr>
+              <w:pStyle w:val="BodyText"/>
+            </w:pPr>
+            <m:oMathPara>
+              <m:oMathParaPr>
+                <m:jc m:val="center"/>
+              </m:oMathParaPr>
+              <m:oMath>
+                <m:f>
+                  <m:fPr>
+                    <m:type m:val="bar"/>
+                  </m:fPr>
+                  <m:num>
                     <m:r>
                       <m:rPr>
                         <m:sty m:val="p"/>
@@ -2595,6 +2955,60 @@
                       <m:t>=</m:t>
                     </m:r>
                     <m:r>
+                      <m:t>1</m:t>
+                    </m:r>
+                    <m:r>
+                      <m:rPr>
+                        <m:sty m:val="p"/>
+                      </m:rPr>
+                      <m:t>]</m:t>
+                    </m:r>
+                    <m:r>
+                      <m:rPr>
+                        <m:sty m:val="p"/>
+                      </m:rPr>
+                      <m:t>/</m:t>
+                    </m:r>
+                    <m:r>
+                      <m:rPr>
+                        <m:sty m:val="p"/>
+                      </m:rPr>
+                      <m:t>Pr</m:t>
+                    </m:r>
+                    <m:r>
+                      <m:rPr>
+                        <m:sty m:val="p"/>
+                      </m:rPr>
+                      <m:t>[</m:t>
+                    </m:r>
+                    <m:sSup>
+                      <m:e>
+                        <m:r>
+                          <m:t>Y</m:t>
+                        </m:r>
+                      </m:e>
+                      <m:sup>
+                        <m:r>
+                          <m:t>a</m:t>
+                        </m:r>
+                        <m:r>
+                          <m:rPr>
+                            <m:sty m:val="p"/>
+                          </m:rPr>
+                          <m:t>=</m:t>
+                        </m:r>
+                        <m:r>
+                          <m:t>1</m:t>
+                        </m:r>
+                      </m:sup>
+                    </m:sSup>
+                    <m:r>
+                      <m:rPr>
+                        <m:sty m:val="p"/>
+                      </m:rPr>
+                      <m:t>=</m:t>
+                    </m:r>
+                    <m:r>
                       <m:t>0</m:t>
                     </m:r>
                     <m:r>
@@ -2712,7 +3126,7 @@
               </m:oMath>
             </m:oMathPara>
           </w:p>
-          <w:bookmarkEnd w:id="18"/>
+          <w:bookmarkEnd w:id="21"/>
         </w:tc>
       </w:tr>
     </w:tbl>
@@ -2906,8 +3320,8 @@
         <w:t xml:space="preserve">on the ratio scale—it is a measure of causal effect in the population but not an average of individual effects.</w:t>
       </w:r>
     </w:p>
-    <w:bookmarkEnd w:id="19"/>
-    <w:bookmarkStart w:id="22" w:name="random-variability-pp.-7-9"/>
+    <w:bookmarkEnd w:id="22"/>
+    <w:bookmarkStart w:id="27" w:name="random-variability-pp.-7-9"/>
     <w:p>
       <w:pPr>
         <w:pStyle w:val="Heading2"/>
@@ -2944,7 +3358,7 @@
         <w:t xml:space="preserve">.</w:t>
       </w:r>
     </w:p>
-    <w:bookmarkStart w:id="20" w:name="sample-vs.-superpopulation"/>
+    <w:bookmarkStart w:id="24" w:name="sample-vs.-superpopulation"/>
     <w:p>
       <w:pPr>
         <w:pStyle w:val="Heading3"/>
@@ -2961,50 +3375,107 @@
         <w:t xml:space="preserve">We can view our study population in two ways:</w:t>
       </w:r>
     </w:p>
-    <w:p>
-      <w:pPr>
-        <w:pStyle w:val="Compact"/>
-        <w:numPr>
-          <w:ilvl w:val="0"/>
-          <w:numId w:val="1005"/>
-        </w:numPr>
-      </w:pPr>
-      <w:r>
-        <w:rPr>
-          <w:b/>
-          <w:bCs/>
-        </w:rPr>
-        <w:t xml:space="preserve">Fixed population</w:t>
-      </w:r>
-      <w:r>
-        <w:t xml:space="preserve">: The 20 individuals are the entire population of interest</w:t>
-      </w:r>
-    </w:p>
-    <w:p>
-      <w:pPr>
-        <w:pStyle w:val="Compact"/>
-        <w:numPr>
-          <w:ilvl w:val="0"/>
-          <w:numId w:val="1005"/>
-        </w:numPr>
-      </w:pPr>
-      <w:r>
-        <w:rPr>
-          <w:b/>
-          <w:bCs/>
-        </w:rPr>
-        <w:t xml:space="preserve">Random sample</w:t>
-      </w:r>
-      <w:r>
-        <w:t xml:space="preserve">: The 20 individuals are a random sample from a larger</w:t>
-      </w:r>
-      <w:r>
-        <w:t xml:space="preserve"> </w:t>
-      </w:r>
-      <w:r>
-        <w:t xml:space="preserve">“superpopulation”</w:t>
-      </w:r>
-    </w:p>
+    <w:tbl>
+      <w:tblPr>
+        <w:tblStyle w:val="Table"/>
+        <w:tblInd w:w="164" w:type="dxa"/>
+        <w:tblBorders>
+          <w:left w:val="single" w:sz="24" w:space="0" w:color="909090"/>
+        </w:tblBorders>
+        <w:tblCellMar>
+          <w:left w:w="0" w:type="dxa"/>
+          <w:right w:w="0" w:type="dxa"/>
+        </w:tblCellMar>
+        <w:tblLook w:firstRow="0" w:lastRow="0" w:firstColumn="0" w:lastColumn="0" w:noHBand="0" w:noVBand="0" w:val="0000"/>
+      </w:tblPr>
+      <w:tblGrid>
+        <w:gridCol w:w="7920"/>
+      </w:tblGrid>
+      <w:tr>
+        <w:trPr>
+          <w:cantSplit/>
+        </w:trPr>
+        <w:tc>
+          <w:tcPr>
+            <w:tcMar>
+              <w:left w:w="144" w:type="dxa"/>
+            </w:tcMar>
+          </w:tcPr>
+          <w:p>
+            <w:pPr>
+              <w:pStyle w:val="BodyText"/>
+            </w:pPr>
+            <w:pPr>
+              <w:spacing w:before="16" w:after="64"/>
+            </w:pPr>
+          </w:p>
+          <w:bookmarkStart w:id="23" w:name="def-fixed-vs-superpopulation"/>
+          <w:p>
+            <w:pPr>
+              <w:pStyle w:val="BodyText"/>
+            </w:pPr>
+            <w:r>
+              <w:rPr>
+                <w:b/>
+                <w:bCs/>
+              </w:rPr>
+              <w:t xml:space="preserve">Definition 11 (Fixed Population vs. Superpopulation)</w:t>
+            </w:r>
+            <w:r>
+              <w:t xml:space="preserve"> </w:t>
+            </w:r>
+            <w:r>
+              <w:t xml:space="preserve"> </w:t>
+            </w:r>
+          </w:p>
+          <w:p>
+            <w:pPr>
+              <w:pStyle w:val="Compact"/>
+              <w:numPr>
+                <w:ilvl w:val="0"/>
+                <w:numId w:val="1005"/>
+              </w:numPr>
+            </w:pPr>
+            <w:r>
+              <w:rPr>
+                <w:b/>
+                <w:bCs/>
+              </w:rPr>
+              <w:t xml:space="preserve">Fixed population</w:t>
+            </w:r>
+            <w:r>
+              <w:t xml:space="preserve">: The 20 individuals are the entire population of interest.</w:t>
+            </w:r>
+          </w:p>
+          <w:p>
+            <w:pPr>
+              <w:pStyle w:val="Compact"/>
+              <w:numPr>
+                <w:ilvl w:val="0"/>
+                <w:numId w:val="1005"/>
+              </w:numPr>
+            </w:pPr>
+            <w:r>
+              <w:rPr>
+                <w:b/>
+                <w:bCs/>
+              </w:rPr>
+              <w:t xml:space="preserve">Random sample (superpopulation)</w:t>
+            </w:r>
+            <w:r>
+              <w:t xml:space="preserve">: The 20 individuals are a random sample from a larger</w:t>
+            </w:r>
+            <w:r>
+              <w:t xml:space="preserve"> </w:t>
+            </w:r>
+            <w:r>
+              <w:t xml:space="preserve">“superpopulation.”</w:t>
+            </w:r>
+          </w:p>
+          <w:bookmarkEnd w:id="23"/>
+        </w:tc>
+      </w:tr>
+    </w:tbl>
     <w:p>
       <w:pPr>
         <w:pStyle w:val="FirstParagraph"/>
@@ -3349,8 +3820,8 @@
         <w:t xml:space="preserve">Until Chapter 10, we assume our population is extremely large to avoid statistical complications and focus on causal inference concepts.</w:t>
       </w:r>
     </w:p>
-    <w:bookmarkEnd w:id="20"/>
-    <w:bookmarkStart w:id="21" w:name="two-types-of-error"/>
+    <w:bookmarkEnd w:id="24"/>
+    <w:bookmarkStart w:id="26" w:name="two-types-of-error"/>
     <w:p>
       <w:pPr>
         <w:pStyle w:val="Heading3"/>
@@ -3367,44 +3838,101 @@
         <w:t xml:space="preserve">It’s critical to distinguish:</w:t>
       </w:r>
     </w:p>
-    <w:p>
-      <w:pPr>
-        <w:pStyle w:val="Compact"/>
-        <w:numPr>
-          <w:ilvl w:val="0"/>
-          <w:numId w:val="1007"/>
-        </w:numPr>
-      </w:pPr>
-      <w:r>
-        <w:rPr>
-          <w:b/>
-          <w:bCs/>
-        </w:rPr>
-        <w:t xml:space="preserve">Random error</w:t>
-      </w:r>
-      <w:r>
-        <w:t xml:space="preserve">: Due to sampling variability; reduced by larger sample sizes</w:t>
-      </w:r>
-    </w:p>
-    <w:p>
-      <w:pPr>
-        <w:pStyle w:val="Compact"/>
-        <w:numPr>
-          <w:ilvl w:val="0"/>
-          <w:numId w:val="1007"/>
-        </w:numPr>
-      </w:pPr>
-      <w:r>
-        <w:rPr>
-          <w:b/>
-          <w:bCs/>
-        </w:rPr>
-        <w:t xml:space="preserve">Systematic error (bias)</w:t>
-      </w:r>
-      <w:r>
-        <w:t xml:space="preserve">: Due to flaws in study design; NOT reduced by larger samples</w:t>
-      </w:r>
-    </w:p>
+    <w:tbl>
+      <w:tblPr>
+        <w:tblStyle w:val="Table"/>
+        <w:tblInd w:w="164" w:type="dxa"/>
+        <w:tblBorders>
+          <w:left w:val="single" w:sz="24" w:space="0" w:color="909090"/>
+        </w:tblBorders>
+        <w:tblCellMar>
+          <w:left w:w="0" w:type="dxa"/>
+          <w:right w:w="0" w:type="dxa"/>
+        </w:tblCellMar>
+        <w:tblLook w:firstRow="0" w:lastRow="0" w:firstColumn="0" w:lastColumn="0" w:noHBand="0" w:noVBand="0" w:val="0000"/>
+      </w:tblPr>
+      <w:tblGrid>
+        <w:gridCol w:w="7920"/>
+      </w:tblGrid>
+      <w:tr>
+        <w:trPr>
+          <w:cantSplit/>
+        </w:trPr>
+        <w:tc>
+          <w:tcPr>
+            <w:tcMar>
+              <w:left w:w="144" w:type="dxa"/>
+            </w:tcMar>
+          </w:tcPr>
+          <w:p>
+            <w:pPr>
+              <w:pStyle w:val="BodyText"/>
+            </w:pPr>
+            <w:pPr>
+              <w:spacing w:before="16" w:after="64"/>
+            </w:pPr>
+          </w:p>
+          <w:bookmarkStart w:id="25" w:name="def-random-systematic-error"/>
+          <w:p>
+            <w:pPr>
+              <w:pStyle w:val="BodyText"/>
+            </w:pPr>
+            <w:r>
+              <w:rPr>
+                <w:b/>
+                <w:bCs/>
+              </w:rPr>
+              <w:t xml:space="preserve">Definition 12 (Random Error vs. Systematic Error)</w:t>
+            </w:r>
+            <w:r>
+              <w:t xml:space="preserve"> </w:t>
+            </w:r>
+            <w:r>
+              <w:t xml:space="preserve"> </w:t>
+            </w:r>
+          </w:p>
+          <w:p>
+            <w:pPr>
+              <w:pStyle w:val="Compact"/>
+              <w:numPr>
+                <w:ilvl w:val="0"/>
+                <w:numId w:val="1007"/>
+              </w:numPr>
+            </w:pPr>
+            <w:r>
+              <w:rPr>
+                <w:b/>
+                <w:bCs/>
+              </w:rPr>
+              <w:t xml:space="preserve">Random error</w:t>
+            </w:r>
+            <w:r>
+              <w:t xml:space="preserve">: Error due to sampling variability; reduced by larger sample sizes.</w:t>
+            </w:r>
+          </w:p>
+          <w:p>
+            <w:pPr>
+              <w:pStyle w:val="Compact"/>
+              <w:numPr>
+                <w:ilvl w:val="0"/>
+                <w:numId w:val="1007"/>
+              </w:numPr>
+            </w:pPr>
+            <w:r>
+              <w:rPr>
+                <w:b/>
+                <w:bCs/>
+              </w:rPr>
+              <w:t xml:space="preserve">Systematic error (bias)</w:t>
+            </w:r>
+            <w:r>
+              <w:t xml:space="preserve">: Error due to flaws in study design; NOT reduced by larger samples.</w:t>
+            </w:r>
+          </w:p>
+          <w:bookmarkEnd w:id="25"/>
+        </w:tc>
+      </w:tr>
+    </w:tbl>
     <w:p>
       <w:pPr>
         <w:pStyle w:val="FirstParagraph"/>
@@ -3413,9 +3941,9 @@
         <w:t xml:space="preserve">With a very large sample, random error becomes negligible, and systematic error dominates. This is why proper study design and appropriate methods are essential for causal inference.</w:t>
       </w:r>
     </w:p>
-    <w:bookmarkEnd w:id="21"/>
-    <w:bookmarkEnd w:id="22"/>
-    <w:bookmarkStart w:id="28" w:name="causation-versus-association-pp.-9-12"/>
+    <w:bookmarkEnd w:id="26"/>
+    <w:bookmarkEnd w:id="27"/>
+    <w:bookmarkStart w:id="37" w:name="causation-versus-association-pp.-9-12"/>
     <w:p>
       <w:pPr>
         <w:pStyle w:val="Heading2"/>
@@ -3468,7 +3996,7 @@
         <w:t xml:space="preserve">.</w:t>
       </w:r>
     </w:p>
-    <w:bookmarkStart w:id="23" w:name="association-measures"/>
+    <w:bookmarkStart w:id="28" w:name="association-measures"/>
     <w:p>
       <w:pPr>
         <w:pStyle w:val="Heading3"/>
@@ -3699,8 +4227,8 @@
         </m:r>
       </m:oMath>
     </w:p>
-    <w:bookmarkEnd w:id="23"/>
-    <w:bookmarkStart w:id="25" w:name="definitions-of-association"/>
+    <w:bookmarkEnd w:id="28"/>
+    <w:bookmarkStart w:id="33" w:name="definitions-of-association"/>
     <w:p>
       <w:pPr>
         <w:pStyle w:val="Heading3"/>
@@ -3743,7 +4271,7 @@
               <w:spacing w:before="16" w:after="64"/>
             </w:pPr>
           </w:p>
-          <w:bookmarkStart w:id="24" w:name="def-independence-ch1"/>
+          <w:bookmarkStart w:id="29" w:name="def-independence-ch1"/>
           <w:p>
             <w:pPr>
               <w:pStyle w:val="BodyText"/>
@@ -3753,7 +4281,7 @@
                 <w:b/>
                 <w:bCs/>
               </w:rPr>
-              <w:t xml:space="preserve">Definition 8 (Independence and Association)</w:t>
+              <w:t xml:space="preserve">Definition 13 (Independence and Association)</w:t>
             </w:r>
             <w:r>
               <w:t xml:space="preserve"> </w:t>
@@ -4123,7 +4651,7 @@
               <w:t xml:space="preserve">.</w:t>
             </w:r>
           </w:p>
-          <w:bookmarkEnd w:id="24"/>
+          <w:bookmarkEnd w:id="29"/>
         </w:tc>
       </w:tr>
     </w:tbl>
@@ -4131,11 +4659,655 @@
       <w:pPr>
         <w:pStyle w:val="BodyText"/>
       </w:pPr>
-      <w:ins w:id="67" w:author="PR Preview" w:date="2024-01-01T00:00:00Z">
+      <w:ins w:id="62" w:author="PR Preview" w:date="2024-01-01T00:00:00Z">
         <w:r>
-          <w:t xml:space="preserve">Association measures include:</w:t>
+          <w:t xml:space="preserve">Association measures include the associational risk difference, risk ratio, and odds ratio.</w:t>
         </w:r>
       </w:ins>
+    </w:p>
+    <w:tbl>
+      <w:tblPr>
+        <w:tblStyle w:val="Table"/>
+        <w:tblInd w:w="164" w:type="dxa"/>
+        <w:tblBorders>
+          <w:left w:val="single" w:sz="24" w:space="0" w:color="909090"/>
+        </w:tblBorders>
+        <w:tblCellMar>
+          <w:left w:w="0" w:type="dxa"/>
+          <w:right w:w="0" w:type="dxa"/>
+        </w:tblCellMar>
+        <w:tblLook w:firstRow="0" w:lastRow="0" w:firstColumn="0" w:lastColumn="0" w:noHBand="0" w:noVBand="0" w:val="0000"/>
+      </w:tblPr>
+      <w:tblGrid>
+        <w:gridCol w:w="7920"/>
+      </w:tblGrid>
+      <w:tr>
+        <w:trPr>
+          <w:cantSplit/>
+        </w:trPr>
+        <w:tc>
+          <w:tcPr>
+            <w:tcMar>
+              <w:left w:w="144" w:type="dxa"/>
+            </w:tcMar>
+          </w:tcPr>
+          <w:p>
+            <w:pPr>
+              <w:pStyle w:val="BodyText"/>
+            </w:pPr>
+            <w:pPr>
+              <w:spacing w:before="16" w:after="64"/>
+            </w:pPr>
+          </w:p>
+          <w:bookmarkStart w:id="30" w:name="def-associational-risk-difference"/>
+          <w:p>
+            <w:pPr>
+              <w:pStyle w:val="BodyText"/>
+            </w:pPr>
+            <w:r>
+              <w:rPr>
+                <w:b/>
+                <w:bCs/>
+              </w:rPr>
+              <w:t xml:space="preserve">Definition 14 (Associational Risk Difference)</w:t>
+            </w:r>
+          </w:p>
+          <w:p>
+            <w:pPr>
+              <w:pStyle w:val="BodyText"/>
+            </w:pPr>
+            <m:oMathPara>
+              <m:oMathParaPr>
+                <m:jc m:val="center"/>
+              </m:oMathParaPr>
+              <m:oMath>
+                <m:r>
+                  <m:rPr>
+                    <m:sty m:val="p"/>
+                  </m:rPr>
+                  <m:t>Pr</m:t>
+                </m:r>
+                <m:r>
+                  <m:rPr>
+                    <m:sty m:val="p"/>
+                  </m:rPr>
+                  <m:t>[</m:t>
+                </m:r>
+                <m:r>
+                  <m:t>Y</m:t>
+                </m:r>
+                <m:r>
+                  <m:rPr>
+                    <m:sty m:val="p"/>
+                  </m:rPr>
+                  <m:t>=</m:t>
+                </m:r>
+                <m:r>
+                  <m:t>1</m:t>
+                </m:r>
+                <m:r>
+                  <m:rPr>
+                    <m:sty m:val="p"/>
+                  </m:rPr>
+                  <m:t>|</m:t>
+                </m:r>
+                <m:r>
+                  <m:t>A</m:t>
+                </m:r>
+                <m:r>
+                  <m:rPr>
+                    <m:sty m:val="p"/>
+                  </m:rPr>
+                  <m:t>=</m:t>
+                </m:r>
+                <m:r>
+                  <m:t>1</m:t>
+                </m:r>
+                <m:r>
+                  <m:rPr>
+                    <m:sty m:val="p"/>
+                  </m:rPr>
+                  <m:t>]</m:t>
+                </m:r>
+                <m:r>
+                  <m:rPr>
+                    <m:sty m:val="p"/>
+                  </m:rPr>
+                  <m:t>−</m:t>
+                </m:r>
+                <m:r>
+                  <m:rPr>
+                    <m:sty m:val="p"/>
+                  </m:rPr>
+                  <m:t>Pr</m:t>
+                </m:r>
+                <m:r>
+                  <m:rPr>
+                    <m:sty m:val="p"/>
+                  </m:rPr>
+                  <m:t>[</m:t>
+                </m:r>
+                <m:r>
+                  <m:t>Y</m:t>
+                </m:r>
+                <m:r>
+                  <m:rPr>
+                    <m:sty m:val="p"/>
+                  </m:rPr>
+                  <m:t>=</m:t>
+                </m:r>
+                <m:r>
+                  <m:t>1</m:t>
+                </m:r>
+                <m:r>
+                  <m:rPr>
+                    <m:sty m:val="p"/>
+                  </m:rPr>
+                  <m:t>|</m:t>
+                </m:r>
+                <m:r>
+                  <m:t>A</m:t>
+                </m:r>
+                <m:r>
+                  <m:rPr>
+                    <m:sty m:val="p"/>
+                  </m:rPr>
+                  <m:t>=</m:t>
+                </m:r>
+                <m:r>
+                  <m:t>0</m:t>
+                </m:r>
+                <m:r>
+                  <m:rPr>
+                    <m:sty m:val="p"/>
+                  </m:rPr>
+                  <m:t>]</m:t>
+                </m:r>
+              </m:oMath>
+            </m:oMathPara>
+          </w:p>
+          <w:bookmarkEnd w:id="30"/>
+        </w:tc>
+      </w:tr>
+    </w:tbl>
+    <w:p>
+      <w:pPr>
+        <w:pStyle w:val="FirstParagraph"/>
+      </w:pPr>
+      <w:ins w:id="63" w:author="PR Preview" w:date="2024-01-01T00:00:00Z">
+        <w:r>
+          <w:t xml:space="preserve"> </w:t>
+        </w:r>
+      </w:ins>
+    </w:p>
+    <w:tbl>
+      <w:tblPr>
+        <w:tblStyle w:val="Table"/>
+        <w:tblInd w:w="164" w:type="dxa"/>
+        <w:tblBorders>
+          <w:left w:val="single" w:sz="24" w:space="0" w:color="909090"/>
+        </w:tblBorders>
+        <w:tblCellMar>
+          <w:left w:w="0" w:type="dxa"/>
+          <w:right w:w="0" w:type="dxa"/>
+        </w:tblCellMar>
+        <w:tblLook w:firstRow="0" w:lastRow="0" w:firstColumn="0" w:lastColumn="0" w:noHBand="0" w:noVBand="0" w:val="0000"/>
+      </w:tblPr>
+      <w:tblGrid>
+        <w:gridCol w:w="7920"/>
+      </w:tblGrid>
+      <w:tr>
+        <w:trPr>
+          <w:cantSplit/>
+        </w:trPr>
+        <w:tc>
+          <w:tcPr>
+            <w:tcMar>
+              <w:left w:w="144" w:type="dxa"/>
+            </w:tcMar>
+          </w:tcPr>
+          <w:p>
+            <w:pPr>
+              <w:pStyle w:val="BodyText"/>
+            </w:pPr>
+            <w:pPr>
+              <w:spacing w:before="16" w:after="64"/>
+            </w:pPr>
+          </w:p>
+          <w:bookmarkStart w:id="31" w:name="def-associational-risk-ratio"/>
+          <w:p>
+            <w:pPr>
+              <w:pStyle w:val="BodyText"/>
+            </w:pPr>
+            <w:r>
+              <w:rPr>
+                <w:b/>
+                <w:bCs/>
+              </w:rPr>
+              <w:t xml:space="preserve">Definition 15 (Associational Risk Ratio)</w:t>
+            </w:r>
+          </w:p>
+          <w:p>
+            <w:pPr>
+              <w:pStyle w:val="BodyText"/>
+            </w:pPr>
+            <m:oMathPara>
+              <m:oMathParaPr>
+                <m:jc m:val="center"/>
+              </m:oMathParaPr>
+              <m:oMath>
+                <m:r>
+                  <m:rPr>
+                    <m:sty m:val="p"/>
+                  </m:rPr>
+                  <m:t>Pr</m:t>
+                </m:r>
+                <m:r>
+                  <m:rPr>
+                    <m:sty m:val="p"/>
+                  </m:rPr>
+                  <m:t>[</m:t>
+                </m:r>
+                <m:r>
+                  <m:t>Y</m:t>
+                </m:r>
+                <m:r>
+                  <m:rPr>
+                    <m:sty m:val="p"/>
+                  </m:rPr>
+                  <m:t>=</m:t>
+                </m:r>
+                <m:r>
+                  <m:t>1</m:t>
+                </m:r>
+                <m:r>
+                  <m:rPr>
+                    <m:sty m:val="p"/>
+                  </m:rPr>
+                  <m:t>|</m:t>
+                </m:r>
+                <m:r>
+                  <m:t>A</m:t>
+                </m:r>
+                <m:r>
+                  <m:rPr>
+                    <m:sty m:val="p"/>
+                  </m:rPr>
+                  <m:t>=</m:t>
+                </m:r>
+                <m:r>
+                  <m:t>1</m:t>
+                </m:r>
+                <m:r>
+                  <m:rPr>
+                    <m:sty m:val="p"/>
+                  </m:rPr>
+                  <m:t>]</m:t>
+                </m:r>
+                <m:r>
+                  <m:rPr>
+                    <m:sty m:val="p"/>
+                  </m:rPr>
+                  <m:t>/</m:t>
+                </m:r>
+                <m:r>
+                  <m:rPr>
+                    <m:sty m:val="p"/>
+                  </m:rPr>
+                  <m:t>Pr</m:t>
+                </m:r>
+                <m:r>
+                  <m:rPr>
+                    <m:sty m:val="p"/>
+                  </m:rPr>
+                  <m:t>[</m:t>
+                </m:r>
+                <m:r>
+                  <m:t>Y</m:t>
+                </m:r>
+                <m:r>
+                  <m:rPr>
+                    <m:sty m:val="p"/>
+                  </m:rPr>
+                  <m:t>=</m:t>
+                </m:r>
+                <m:r>
+                  <m:t>1</m:t>
+                </m:r>
+                <m:r>
+                  <m:rPr>
+                    <m:sty m:val="p"/>
+                  </m:rPr>
+                  <m:t>|</m:t>
+                </m:r>
+                <m:r>
+                  <m:t>A</m:t>
+                </m:r>
+                <m:r>
+                  <m:rPr>
+                    <m:sty m:val="p"/>
+                  </m:rPr>
+                  <m:t>=</m:t>
+                </m:r>
+                <m:r>
+                  <m:t>0</m:t>
+                </m:r>
+                <m:r>
+                  <m:rPr>
+                    <m:sty m:val="p"/>
+                  </m:rPr>
+                  <m:t>]</m:t>
+                </m:r>
+              </m:oMath>
+            </m:oMathPara>
+          </w:p>
+          <w:bookmarkEnd w:id="31"/>
+        </w:tc>
+      </w:tr>
+    </w:tbl>
+    <w:p>
+      <w:pPr>
+        <w:pStyle w:val="FirstParagraph"/>
+      </w:pPr>
+      <w:ins w:id="64" w:author="PR Preview" w:date="2024-01-01T00:00:00Z">
+        <w:r>
+          <w:t xml:space="preserve"> </w:t>
+        </w:r>
+      </w:ins>
+    </w:p>
+    <w:tbl>
+      <w:tblPr>
+        <w:tblStyle w:val="Table"/>
+        <w:tblInd w:w="164" w:type="dxa"/>
+        <w:tblBorders>
+          <w:left w:val="single" w:sz="24" w:space="0" w:color="909090"/>
+        </w:tblBorders>
+        <w:tblCellMar>
+          <w:left w:w="0" w:type="dxa"/>
+          <w:right w:w="0" w:type="dxa"/>
+        </w:tblCellMar>
+        <w:tblLook w:firstRow="0" w:lastRow="0" w:firstColumn="0" w:lastColumn="0" w:noHBand="0" w:noVBand="0" w:val="0000"/>
+      </w:tblPr>
+      <w:tblGrid>
+        <w:gridCol w:w="7920"/>
+      </w:tblGrid>
+      <w:tr>
+        <w:trPr>
+          <w:cantSplit/>
+        </w:trPr>
+        <w:tc>
+          <w:tcPr>
+            <w:tcMar>
+              <w:left w:w="144" w:type="dxa"/>
+            </w:tcMar>
+          </w:tcPr>
+          <w:p>
+            <w:pPr>
+              <w:pStyle w:val="BodyText"/>
+            </w:pPr>
+            <w:pPr>
+              <w:spacing w:before="16" w:after="64"/>
+            </w:pPr>
+          </w:p>
+          <w:bookmarkStart w:id="32" w:name="def-associational-odds-ratio"/>
+          <w:p>
+            <w:pPr>
+              <w:pStyle w:val="BodyText"/>
+            </w:pPr>
+            <w:r>
+              <w:rPr>
+                <w:b/>
+                <w:bCs/>
+              </w:rPr>
+              <w:t xml:space="preserve">Definition 16 (Associational Odds Ratio)</w:t>
+            </w:r>
+          </w:p>
+          <w:p>
+            <w:pPr>
+              <w:pStyle w:val="BodyText"/>
+            </w:pPr>
+            <m:oMathPara>
+              <m:oMathParaPr>
+                <m:jc m:val="center"/>
+              </m:oMathParaPr>
+              <m:oMath>
+                <m:f>
+                  <m:fPr>
+                    <m:type m:val="bar"/>
+                  </m:fPr>
+                  <m:num>
+                    <m:r>
+                      <m:rPr>
+                        <m:sty m:val="p"/>
+                      </m:rPr>
+                      <m:t>Pr</m:t>
+                    </m:r>
+                    <m:r>
+                      <m:rPr>
+                        <m:sty m:val="p"/>
+                      </m:rPr>
+                      <m:t>[</m:t>
+                    </m:r>
+                    <m:r>
+                      <m:t>Y</m:t>
+                    </m:r>
+                    <m:r>
+                      <m:rPr>
+                        <m:sty m:val="p"/>
+                      </m:rPr>
+                      <m:t>=</m:t>
+                    </m:r>
+                    <m:r>
+                      <m:t>1</m:t>
+                    </m:r>
+                    <m:r>
+                      <m:rPr>
+                        <m:sty m:val="p"/>
+                      </m:rPr>
+                      <m:t>|</m:t>
+                    </m:r>
+                    <m:r>
+                      <m:t>A</m:t>
+                    </m:r>
+                    <m:r>
+                      <m:rPr>
+                        <m:sty m:val="p"/>
+                      </m:rPr>
+                      <m:t>=</m:t>
+                    </m:r>
+                    <m:r>
+                      <m:t>1</m:t>
+                    </m:r>
+                    <m:r>
+                      <m:rPr>
+                        <m:sty m:val="p"/>
+                      </m:rPr>
+                      <m:t>]</m:t>
+                    </m:r>
+                    <m:r>
+                      <m:rPr>
+                        <m:sty m:val="p"/>
+                      </m:rPr>
+                      <m:t>/</m:t>
+                    </m:r>
+                    <m:r>
+                      <m:rPr>
+                        <m:sty m:val="p"/>
+                      </m:rPr>
+                      <m:t>Pr</m:t>
+                    </m:r>
+                    <m:r>
+                      <m:rPr>
+                        <m:sty m:val="p"/>
+                      </m:rPr>
+                      <m:t>[</m:t>
+                    </m:r>
+                    <m:r>
+                      <m:t>Y</m:t>
+                    </m:r>
+                    <m:r>
+                      <m:rPr>
+                        <m:sty m:val="p"/>
+                      </m:rPr>
+                      <m:t>=</m:t>
+                    </m:r>
+                    <m:r>
+                      <m:t>0</m:t>
+                    </m:r>
+                    <m:r>
+                      <m:rPr>
+                        <m:sty m:val="p"/>
+                      </m:rPr>
+                      <m:t>|</m:t>
+                    </m:r>
+                    <m:r>
+                      <m:t>A</m:t>
+                    </m:r>
+                    <m:r>
+                      <m:rPr>
+                        <m:sty m:val="p"/>
+                      </m:rPr>
+                      <m:t>=</m:t>
+                    </m:r>
+                    <m:r>
+                      <m:t>1</m:t>
+                    </m:r>
+                    <m:r>
+                      <m:rPr>
+                        <m:sty m:val="p"/>
+                      </m:rPr>
+                      <m:t>]</m:t>
+                    </m:r>
+                  </m:num>
+                  <m:den>
+                    <m:r>
+                      <m:rPr>
+                        <m:sty m:val="p"/>
+                      </m:rPr>
+                      <m:t>Pr</m:t>
+                    </m:r>
+                    <m:r>
+                      <m:rPr>
+                        <m:sty m:val="p"/>
+                      </m:rPr>
+                      <m:t>[</m:t>
+                    </m:r>
+                    <m:r>
+                      <m:t>Y</m:t>
+                    </m:r>
+                    <m:r>
+                      <m:rPr>
+                        <m:sty m:val="p"/>
+                      </m:rPr>
+                      <m:t>=</m:t>
+                    </m:r>
+                    <m:r>
+                      <m:t>1</m:t>
+                    </m:r>
+                    <m:r>
+                      <m:rPr>
+                        <m:sty m:val="p"/>
+                      </m:rPr>
+                      <m:t>|</m:t>
+                    </m:r>
+                    <m:r>
+                      <m:t>A</m:t>
+                    </m:r>
+                    <m:r>
+                      <m:rPr>
+                        <m:sty m:val="p"/>
+                      </m:rPr>
+                      <m:t>=</m:t>
+                    </m:r>
+                    <m:r>
+                      <m:t>0</m:t>
+                    </m:r>
+                    <m:r>
+                      <m:rPr>
+                        <m:sty m:val="p"/>
+                      </m:rPr>
+                      <m:t>]</m:t>
+                    </m:r>
+                    <m:r>
+                      <m:rPr>
+                        <m:sty m:val="p"/>
+                      </m:rPr>
+                      <m:t>/</m:t>
+                    </m:r>
+                    <m:r>
+                      <m:rPr>
+                        <m:sty m:val="p"/>
+                      </m:rPr>
+                      <m:t>Pr</m:t>
+                    </m:r>
+                    <m:r>
+                      <m:rPr>
+                        <m:sty m:val="p"/>
+                      </m:rPr>
+                      <m:t>[</m:t>
+                    </m:r>
+                    <m:r>
+                      <m:t>Y</m:t>
+                    </m:r>
+                    <m:r>
+                      <m:rPr>
+                        <m:sty m:val="p"/>
+                      </m:rPr>
+                      <m:t>=</m:t>
+                    </m:r>
+                    <m:r>
+                      <m:t>0</m:t>
+                    </m:r>
+                    <m:r>
+                      <m:rPr>
+                        <m:sty m:val="p"/>
+                      </m:rPr>
+                      <m:t>|</m:t>
+                    </m:r>
+                    <m:r>
+                      <m:t>A</m:t>
+                    </m:r>
+                    <m:r>
+                      <m:rPr>
+                        <m:sty m:val="p"/>
+                      </m:rPr>
+                      <m:t>=</m:t>
+                    </m:r>
+                    <m:r>
+                      <m:t>0</m:t>
+                    </m:r>
+                    <m:r>
+                      <m:rPr>
+                        <m:sty m:val="p"/>
+                      </m:rPr>
+                      <m:t>]</m:t>
+                    </m:r>
+                  </m:den>
+                </m:f>
+              </m:oMath>
+            </m:oMathPara>
+          </w:p>
+          <w:bookmarkEnd w:id="32"/>
+        </w:tc>
+      </w:tr>
+    </w:tbl>
+    <w:bookmarkEnd w:id="33"/>
+    <w:bookmarkStart w:id="35" w:name="causation-vs.-association"/>
+    <w:p>
+      <w:pPr>
+        <w:pStyle w:val="Heading3"/>
+      </w:pPr>
+      <w:r>
+        <w:t xml:space="preserve">5.3 Causation vs. Association</w:t>
+      </w:r>
+    </w:p>
+    <w:p>
+      <w:pPr>
+        <w:pStyle w:val="FirstParagraph"/>
+      </w:pPr>
+      <w:r>
+        <w:t xml:space="preserve">In our example:</w:t>
+      </w:r>
     </w:p>
     <w:p>
       <w:pPr>
@@ -4150,7 +5322,7 @@
           <w:b/>
           <w:bCs/>
         </w:rPr>
-        <w:t xml:space="preserve">Associational risk difference</w:t>
+        <w:t xml:space="preserve">No causal effect</w:t>
       </w:r>
       <w:r>
         <w:t xml:space="preserve">:</w:t>
@@ -4171,9 +5343,27 @@
           </m:rPr>
           <m:t>[</m:t>
         </m:r>
-        <m:r>
-          <m:t>Y</m:t>
-        </m:r>
+        <m:sSup>
+          <m:e>
+            <m:r>
+              <m:t>Y</m:t>
+            </m:r>
+          </m:e>
+          <m:sup>
+            <m:r>
+              <m:t>a</m:t>
+            </m:r>
+            <m:r>
+              <m:rPr>
+                <m:sty m:val="p"/>
+              </m:rPr>
+              <m:t>=</m:t>
+            </m:r>
+            <m:r>
+              <m:t>1</m:t>
+            </m:r>
+          </m:sup>
+        </m:sSup>
         <m:r>
           <m:rPr>
             <m:sty m:val="p"/>
@@ -4187,10 +5377,7 @@
           <m:rPr>
             <m:sty m:val="p"/>
           </m:rPr>
-          <m:t>|</m:t>
-        </m:r>
-        <m:r>
-          <m:t>A</m:t>
+          <m:t>]</m:t>
         </m:r>
         <m:r>
           <m:rPr>
@@ -4199,6 +5386,45 @@
           <m:t>=</m:t>
         </m:r>
         <m:r>
+          <m:rPr>
+            <m:sty m:val="p"/>
+          </m:rPr>
+          <m:t>Pr</m:t>
+        </m:r>
+        <m:r>
+          <m:rPr>
+            <m:sty m:val="p"/>
+          </m:rPr>
+          <m:t>[</m:t>
+        </m:r>
+        <m:sSup>
+          <m:e>
+            <m:r>
+              <m:t>Y</m:t>
+            </m:r>
+          </m:e>
+          <m:sup>
+            <m:r>
+              <m:t>a</m:t>
+            </m:r>
+            <m:r>
+              <m:rPr>
+                <m:sty m:val="p"/>
+              </m:rPr>
+              <m:t>=</m:t>
+            </m:r>
+            <m:r>
+              <m:t>0</m:t>
+            </m:r>
+          </m:sup>
+        </m:sSup>
+        <m:r>
+          <m:rPr>
+            <m:sty m:val="p"/>
+          </m:rPr>
+          <m:t>=</m:t>
+        </m:r>
+        <m:r>
           <m:t>1</m:t>
         </m:r>
         <m:r>
@@ -4211,55 +5437,10 @@
           <m:rPr>
             <m:sty m:val="p"/>
           </m:rPr>
-          <m:t>−</m:t>
-        </m:r>
-        <m:r>
-          <m:rPr>
-            <m:sty m:val="p"/>
-          </m:rPr>
-          <m:t>Pr</m:t>
-        </m:r>
-        <m:r>
-          <m:rPr>
-            <m:sty m:val="p"/>
-          </m:rPr>
-          <m:t>[</m:t>
-        </m:r>
-        <m:r>
-          <m:t>Y</m:t>
-        </m:r>
-        <m:r>
-          <m:rPr>
-            <m:sty m:val="p"/>
-          </m:rPr>
           <m:t>=</m:t>
         </m:r>
         <m:r>
-          <m:t>1</m:t>
-        </m:r>
-        <m:r>
-          <m:rPr>
-            <m:sty m:val="p"/>
-          </m:rPr>
-          <m:t>|</m:t>
-        </m:r>
-        <m:r>
-          <m:t>A</m:t>
-        </m:r>
-        <m:r>
-          <m:rPr>
-            <m:sty m:val="p"/>
-          </m:rPr>
-          <m:t>=</m:t>
-        </m:r>
-        <m:r>
-          <m:t>0</m:t>
-        </m:r>
-        <m:r>
-          <m:rPr>
-            <m:sty m:val="p"/>
-          </m:rPr>
-          <m:t>]</m:t>
+          <m:t>0.5</m:t>
         </m:r>
       </m:oMath>
     </w:p>
@@ -4276,525 +5457,6 @@
           <w:b/>
           <w:bCs/>
         </w:rPr>
-        <w:t xml:space="preserve">Associational risk ratio</w:t>
-      </w:r>
-      <w:r>
-        <w:t xml:space="preserve">:</w:t>
-      </w:r>
-      <w:r>
-        <w:t xml:space="preserve"> </w:t>
-      </w:r>
-      <m:oMath>
-        <m:r>
-          <m:rPr>
-            <m:sty m:val="p"/>
-          </m:rPr>
-          <m:t>Pr</m:t>
-        </m:r>
-        <m:r>
-          <m:rPr>
-            <m:sty m:val="p"/>
-          </m:rPr>
-          <m:t>[</m:t>
-        </m:r>
-        <m:r>
-          <m:t>Y</m:t>
-        </m:r>
-        <m:r>
-          <m:rPr>
-            <m:sty m:val="p"/>
-          </m:rPr>
-          <m:t>=</m:t>
-        </m:r>
-        <m:r>
-          <m:t>1</m:t>
-        </m:r>
-        <m:r>
-          <m:rPr>
-            <m:sty m:val="p"/>
-          </m:rPr>
-          <m:t>|</m:t>
-        </m:r>
-        <m:r>
-          <m:t>A</m:t>
-        </m:r>
-        <m:r>
-          <m:rPr>
-            <m:sty m:val="p"/>
-          </m:rPr>
-          <m:t>=</m:t>
-        </m:r>
-        <m:r>
-          <m:t>1</m:t>
-        </m:r>
-        <m:r>
-          <m:rPr>
-            <m:sty m:val="p"/>
-          </m:rPr>
-          <m:t>]</m:t>
-        </m:r>
-        <m:r>
-          <m:rPr>
-            <m:sty m:val="p"/>
-          </m:rPr>
-          <m:t>/</m:t>
-        </m:r>
-        <m:r>
-          <m:rPr>
-            <m:sty m:val="p"/>
-          </m:rPr>
-          <m:t>Pr</m:t>
-        </m:r>
-        <m:r>
-          <m:rPr>
-            <m:sty m:val="p"/>
-          </m:rPr>
-          <m:t>[</m:t>
-        </m:r>
-        <m:r>
-          <m:t>Y</m:t>
-        </m:r>
-        <m:r>
-          <m:rPr>
-            <m:sty m:val="p"/>
-          </m:rPr>
-          <m:t>=</m:t>
-        </m:r>
-        <m:r>
-          <m:t>1</m:t>
-        </m:r>
-        <m:r>
-          <m:rPr>
-            <m:sty m:val="p"/>
-          </m:rPr>
-          <m:t>|</m:t>
-        </m:r>
-        <m:r>
-          <m:t>A</m:t>
-        </m:r>
-        <m:r>
-          <m:rPr>
-            <m:sty m:val="p"/>
-          </m:rPr>
-          <m:t>=</m:t>
-        </m:r>
-        <m:r>
-          <m:t>0</m:t>
-        </m:r>
-        <m:r>
-          <m:rPr>
-            <m:sty m:val="p"/>
-          </m:rPr>
-          <m:t>]</m:t>
-        </m:r>
-      </m:oMath>
-      <w:r>
-        <w:br/>
-      </w:r>
-    </w:p>
-    <w:p>
-      <w:pPr>
-        <w:pStyle w:val="Compact"/>
-        <w:numPr>
-          <w:ilvl w:val="0"/>
-          <w:numId w:val="1008"/>
-        </w:numPr>
-      </w:pPr>
-      <w:r>
-        <w:rPr>
-          <w:b/>
-          <w:bCs/>
-        </w:rPr>
-        <w:t xml:space="preserve">Associational odds ratio</w:t>
-      </w:r>
-      <w:r>
-        <w:t xml:space="preserve">:</w:t>
-      </w:r>
-      <w:r>
-        <w:t xml:space="preserve"> </w:t>
-      </w:r>
-      <m:oMath>
-        <m:f>
-          <m:fPr>
-            <m:type m:val="bar"/>
-          </m:fPr>
-          <m:num>
-            <m:r>
-              <m:rPr>
-                <m:sty m:val="p"/>
-              </m:rPr>
-              <m:t>Pr</m:t>
-            </m:r>
-            <m:r>
-              <m:rPr>
-                <m:sty m:val="p"/>
-              </m:rPr>
-              <m:t>[</m:t>
-            </m:r>
-            <m:r>
-              <m:t>Y</m:t>
-            </m:r>
-            <m:r>
-              <m:rPr>
-                <m:sty m:val="p"/>
-              </m:rPr>
-              <m:t>=</m:t>
-            </m:r>
-            <m:r>
-              <m:t>1</m:t>
-            </m:r>
-            <m:r>
-              <m:rPr>
-                <m:sty m:val="p"/>
-              </m:rPr>
-              <m:t>|</m:t>
-            </m:r>
-            <m:r>
-              <m:t>A</m:t>
-            </m:r>
-            <m:r>
-              <m:rPr>
-                <m:sty m:val="p"/>
-              </m:rPr>
-              <m:t>=</m:t>
-            </m:r>
-            <m:r>
-              <m:t>1</m:t>
-            </m:r>
-            <m:r>
-              <m:rPr>
-                <m:sty m:val="p"/>
-              </m:rPr>
-              <m:t>]</m:t>
-            </m:r>
-            <m:r>
-              <m:rPr>
-                <m:sty m:val="p"/>
-              </m:rPr>
-              <m:t>/</m:t>
-            </m:r>
-            <m:r>
-              <m:rPr>
-                <m:sty m:val="p"/>
-              </m:rPr>
-              <m:t>Pr</m:t>
-            </m:r>
-            <m:r>
-              <m:rPr>
-                <m:sty m:val="p"/>
-              </m:rPr>
-              <m:t>[</m:t>
-            </m:r>
-            <m:r>
-              <m:t>Y</m:t>
-            </m:r>
-            <m:r>
-              <m:rPr>
-                <m:sty m:val="p"/>
-              </m:rPr>
-              <m:t>=</m:t>
-            </m:r>
-            <m:r>
-              <m:t>0</m:t>
-            </m:r>
-            <m:r>
-              <m:rPr>
-                <m:sty m:val="p"/>
-              </m:rPr>
-              <m:t>|</m:t>
-            </m:r>
-            <m:r>
-              <m:t>A</m:t>
-            </m:r>
-            <m:r>
-              <m:rPr>
-                <m:sty m:val="p"/>
-              </m:rPr>
-              <m:t>=</m:t>
-            </m:r>
-            <m:r>
-              <m:t>1</m:t>
-            </m:r>
-            <m:r>
-              <m:rPr>
-                <m:sty m:val="p"/>
-              </m:rPr>
-              <m:t>]</m:t>
-            </m:r>
-          </m:num>
-          <m:den>
-            <m:r>
-              <m:rPr>
-                <m:sty m:val="p"/>
-              </m:rPr>
-              <m:t>Pr</m:t>
-            </m:r>
-            <m:r>
-              <m:rPr>
-                <m:sty m:val="p"/>
-              </m:rPr>
-              <m:t>[</m:t>
-            </m:r>
-            <m:r>
-              <m:t>Y</m:t>
-            </m:r>
-            <m:r>
-              <m:rPr>
-                <m:sty m:val="p"/>
-              </m:rPr>
-              <m:t>=</m:t>
-            </m:r>
-            <m:r>
-              <m:t>1</m:t>
-            </m:r>
-            <m:r>
-              <m:rPr>
-                <m:sty m:val="p"/>
-              </m:rPr>
-              <m:t>|</m:t>
-            </m:r>
-            <m:r>
-              <m:t>A</m:t>
-            </m:r>
-            <m:r>
-              <m:rPr>
-                <m:sty m:val="p"/>
-              </m:rPr>
-              <m:t>=</m:t>
-            </m:r>
-            <m:r>
-              <m:t>0</m:t>
-            </m:r>
-            <m:r>
-              <m:rPr>
-                <m:sty m:val="p"/>
-              </m:rPr>
-              <m:t>]</m:t>
-            </m:r>
-            <m:r>
-              <m:rPr>
-                <m:sty m:val="p"/>
-              </m:rPr>
-              <m:t>/</m:t>
-            </m:r>
-            <m:r>
-              <m:rPr>
-                <m:sty m:val="p"/>
-              </m:rPr>
-              <m:t>Pr</m:t>
-            </m:r>
-            <m:r>
-              <m:rPr>
-                <m:sty m:val="p"/>
-              </m:rPr>
-              <m:t>[</m:t>
-            </m:r>
-            <m:r>
-              <m:t>Y</m:t>
-            </m:r>
-            <m:r>
-              <m:rPr>
-                <m:sty m:val="p"/>
-              </m:rPr>
-              <m:t>=</m:t>
-            </m:r>
-            <m:r>
-              <m:t>0</m:t>
-            </m:r>
-            <m:r>
-              <m:rPr>
-                <m:sty m:val="p"/>
-              </m:rPr>
-              <m:t>|</m:t>
-            </m:r>
-            <m:r>
-              <m:t>A</m:t>
-            </m:r>
-            <m:r>
-              <m:rPr>
-                <m:sty m:val="p"/>
-              </m:rPr>
-              <m:t>=</m:t>
-            </m:r>
-            <m:r>
-              <m:t>0</m:t>
-            </m:r>
-            <m:r>
-              <m:rPr>
-                <m:sty m:val="p"/>
-              </m:rPr>
-              <m:t>]</m:t>
-            </m:r>
-          </m:den>
-        </m:f>
-      </m:oMath>
-    </w:p>
-    <w:bookmarkEnd w:id="25"/>
-    <w:bookmarkStart w:id="26" w:name="causation-vs.-association"/>
-    <w:p>
-      <w:pPr>
-        <w:pStyle w:val="Heading3"/>
-      </w:pPr>
-      <w:r>
-        <w:t xml:space="preserve">5.3 Causation vs. Association</w:t>
-      </w:r>
-    </w:p>
-    <w:p>
-      <w:pPr>
-        <w:pStyle w:val="FirstParagraph"/>
-      </w:pPr>
-      <w:r>
-        <w:t xml:space="preserve">In our example:</w:t>
-      </w:r>
-    </w:p>
-    <w:p>
-      <w:pPr>
-        <w:pStyle w:val="Compact"/>
-        <w:numPr>
-          <w:ilvl w:val="0"/>
-          <w:numId w:val="1009"/>
-        </w:numPr>
-      </w:pPr>
-      <w:r>
-        <w:rPr>
-          <w:b/>
-          <w:bCs/>
-        </w:rPr>
-        <w:t xml:space="preserve">No causal effect</w:t>
-      </w:r>
-      <w:r>
-        <w:t xml:space="preserve">:</w:t>
-      </w:r>
-      <w:r>
-        <w:t xml:space="preserve"> </w:t>
-      </w:r>
-      <m:oMath>
-        <m:r>
-          <m:rPr>
-            <m:sty m:val="p"/>
-          </m:rPr>
-          <m:t>Pr</m:t>
-        </m:r>
-        <m:r>
-          <m:rPr>
-            <m:sty m:val="p"/>
-          </m:rPr>
-          <m:t>[</m:t>
-        </m:r>
-        <m:sSup>
-          <m:e>
-            <m:r>
-              <m:t>Y</m:t>
-            </m:r>
-          </m:e>
-          <m:sup>
-            <m:r>
-              <m:t>a</m:t>
-            </m:r>
-            <m:r>
-              <m:rPr>
-                <m:sty m:val="p"/>
-              </m:rPr>
-              <m:t>=</m:t>
-            </m:r>
-            <m:r>
-              <m:t>1</m:t>
-            </m:r>
-          </m:sup>
-        </m:sSup>
-        <m:r>
-          <m:rPr>
-            <m:sty m:val="p"/>
-          </m:rPr>
-          <m:t>=</m:t>
-        </m:r>
-        <m:r>
-          <m:t>1</m:t>
-        </m:r>
-        <m:r>
-          <m:rPr>
-            <m:sty m:val="p"/>
-          </m:rPr>
-          <m:t>]</m:t>
-        </m:r>
-        <m:r>
-          <m:rPr>
-            <m:sty m:val="p"/>
-          </m:rPr>
-          <m:t>=</m:t>
-        </m:r>
-        <m:r>
-          <m:rPr>
-            <m:sty m:val="p"/>
-          </m:rPr>
-          <m:t>Pr</m:t>
-        </m:r>
-        <m:r>
-          <m:rPr>
-            <m:sty m:val="p"/>
-          </m:rPr>
-          <m:t>[</m:t>
-        </m:r>
-        <m:sSup>
-          <m:e>
-            <m:r>
-              <m:t>Y</m:t>
-            </m:r>
-          </m:e>
-          <m:sup>
-            <m:r>
-              <m:t>a</m:t>
-            </m:r>
-            <m:r>
-              <m:rPr>
-                <m:sty m:val="p"/>
-              </m:rPr>
-              <m:t>=</m:t>
-            </m:r>
-            <m:r>
-              <m:t>0</m:t>
-            </m:r>
-          </m:sup>
-        </m:sSup>
-        <m:r>
-          <m:rPr>
-            <m:sty m:val="p"/>
-          </m:rPr>
-          <m:t>=</m:t>
-        </m:r>
-        <m:r>
-          <m:t>1</m:t>
-        </m:r>
-        <m:r>
-          <m:rPr>
-            <m:sty m:val="p"/>
-          </m:rPr>
-          <m:t>]</m:t>
-        </m:r>
-        <m:r>
-          <m:rPr>
-            <m:sty m:val="p"/>
-          </m:rPr>
-          <m:t>=</m:t>
-        </m:r>
-        <m:r>
-          <m:t>0.5</m:t>
-        </m:r>
-      </m:oMath>
-    </w:p>
-    <w:p>
-      <w:pPr>
-        <w:pStyle w:val="Compact"/>
-        <w:numPr>
-          <w:ilvl w:val="0"/>
-          <w:numId w:val="1009"/>
-        </w:numPr>
-      </w:pPr>
-      <w:r>
-        <w:rPr>
-          <w:b/>
-          <w:bCs/>
-        </w:rPr>
         <w:t xml:space="preserve">Association present</w:t>
       </w:r>
       <w:r>
@@ -4947,368 +5609,387 @@
         <w:t xml:space="preserve">.</w:t>
       </w:r>
     </w:p>
-    <w:p>
-      <w:pPr>
-        <w:pStyle w:val="BodyText"/>
-      </w:pPr>
-      <w:r>
-        <w:t xml:space="preserve">The distinction is:</w:t>
-      </w:r>
-    </w:p>
-    <w:p>
-      <w:pPr>
-        <w:pStyle w:val="Compact"/>
-        <w:numPr>
-          <w:ilvl w:val="0"/>
-          <w:numId w:val="1010"/>
-        </w:numPr>
-      </w:pPr>
-      <w:r>
-        <w:rPr>
-          <w:b/>
-          <w:bCs/>
-        </w:rPr>
-        <w:t xml:space="preserve">Causation</w:t>
-      </w:r>
-      <w:r>
-        <w:t xml:space="preserve">: Compares the</w:t>
-      </w:r>
-      <w:r>
-        <w:t xml:space="preserve"> </w:t>
-      </w:r>
-      <w:r>
-        <w:rPr>
-          <w:i/>
-          <w:iCs/>
-        </w:rPr>
-        <w:t xml:space="preserve">same</w:t>
-      </w:r>
-      <w:r>
-        <w:t xml:space="preserve"> </w:t>
-      </w:r>
-      <w:r>
-        <w:t xml:space="preserve">population under different treatment values</w:t>
-      </w:r>
-    </w:p>
-    <w:p>
-      <w:pPr>
-        <w:pStyle w:val="Compact"/>
-        <w:numPr>
-          <w:ilvl w:val="1"/>
-          <w:numId w:val="1011"/>
-        </w:numPr>
-      </w:pPr>
-      <w:r>
-        <w:t xml:space="preserve">“What if everyone had been treated?”</w:t>
-      </w:r>
-      <w:r>
-        <w:t xml:space="preserve"> </w:t>
-      </w:r>
-      <w:r>
-        <w:t xml:space="preserve">vs. </w:t>
-      </w:r>
-      <w:r>
-        <w:t xml:space="preserve">“What if everyone had been untreated?”</w:t>
-      </w:r>
-    </w:p>
-    <w:p>
-      <w:pPr>
-        <w:pStyle w:val="Compact"/>
-        <w:numPr>
-          <w:ilvl w:val="1"/>
-          <w:numId w:val="1011"/>
-        </w:numPr>
-      </w:pPr>
-      <w:r>
-        <w:t xml:space="preserve">Uses counterfactual risks:</w:t>
-      </w:r>
-      <w:r>
-        <w:t xml:space="preserve"> </w:t>
-      </w:r>
-      <m:oMath>
-        <m:r>
-          <m:rPr>
-            <m:sty m:val="p"/>
-          </m:rPr>
-          <m:t>Pr</m:t>
-        </m:r>
-        <m:r>
-          <m:rPr>
-            <m:sty m:val="p"/>
-          </m:rPr>
-          <m:t>[</m:t>
-        </m:r>
-        <m:sSup>
-          <m:e>
-            <m:r>
-              <m:t>Y</m:t>
-            </m:r>
-          </m:e>
-          <m:sup>
-            <m:r>
-              <m:t>a</m:t>
-            </m:r>
-            <m:r>
-              <m:rPr>
-                <m:sty m:val="p"/>
-              </m:rPr>
-              <m:t>=</m:t>
-            </m:r>
-            <m:r>
-              <m:t>1</m:t>
-            </m:r>
-          </m:sup>
-        </m:sSup>
-        <m:r>
-          <m:rPr>
-            <m:sty m:val="p"/>
-          </m:rPr>
-          <m:t>=</m:t>
-        </m:r>
-        <m:r>
-          <m:t>1</m:t>
-        </m:r>
-        <m:r>
-          <m:rPr>
-            <m:sty m:val="p"/>
-          </m:rPr>
-          <m:t>]</m:t>
-        </m:r>
-      </m:oMath>
-      <w:r>
-        <w:t xml:space="preserve"> </w:t>
-      </w:r>
-      <w:r>
-        <w:t xml:space="preserve">vs. </w:t>
-      </w:r>
-      <m:oMath>
-        <m:r>
-          <m:rPr>
-            <m:sty m:val="p"/>
-          </m:rPr>
-          <m:t>Pr</m:t>
-        </m:r>
-        <m:r>
-          <m:rPr>
-            <m:sty m:val="p"/>
-          </m:rPr>
-          <m:t>[</m:t>
-        </m:r>
-        <m:sSup>
-          <m:e>
-            <m:r>
-              <m:t>Y</m:t>
-            </m:r>
-          </m:e>
-          <m:sup>
-            <m:r>
-              <m:t>a</m:t>
-            </m:r>
-            <m:r>
-              <m:rPr>
-                <m:sty m:val="p"/>
-              </m:rPr>
-              <m:t>=</m:t>
-            </m:r>
-            <m:r>
-              <m:t>0</m:t>
-            </m:r>
-          </m:sup>
-        </m:sSup>
-        <m:r>
-          <m:rPr>
-            <m:sty m:val="p"/>
-          </m:rPr>
-          <m:t>=</m:t>
-        </m:r>
-        <m:r>
-          <m:t>1</m:t>
-        </m:r>
-        <m:r>
-          <m:rPr>
-            <m:sty m:val="p"/>
-          </m:rPr>
-          <m:t>]</m:t>
-        </m:r>
-      </m:oMath>
-    </w:p>
-    <w:p>
-      <w:pPr>
-        <w:pStyle w:val="Compact"/>
-        <w:numPr>
-          <w:ilvl w:val="0"/>
-          <w:numId w:val="1010"/>
-        </w:numPr>
-      </w:pPr>
-      <w:r>
-        <w:rPr>
-          <w:b/>
-          <w:bCs/>
-        </w:rPr>
-        <w:t xml:space="preserve">Association</w:t>
-      </w:r>
-      <w:r>
-        <w:t xml:space="preserve">: Compares</w:t>
-      </w:r>
-      <w:r>
-        <w:t xml:space="preserve"> </w:t>
-      </w:r>
-      <w:r>
-        <w:rPr>
-          <w:i/>
-          <w:iCs/>
-        </w:rPr>
-        <w:t xml:space="preserve">different subsets</w:t>
-      </w:r>
-      <w:r>
-        <w:t xml:space="preserve"> </w:t>
-      </w:r>
-      <w:r>
-        <w:t xml:space="preserve">of the population</w:t>
-      </w:r>
-    </w:p>
-    <w:p>
-      <w:pPr>
-        <w:pStyle w:val="Compact"/>
-        <w:numPr>
-          <w:ilvl w:val="1"/>
-          <w:numId w:val="1012"/>
-        </w:numPr>
-      </w:pPr>
-      <w:r>
-        <w:t xml:space="preserve">“What is the risk in those who were treated?”</w:t>
-      </w:r>
-      <w:r>
-        <w:t xml:space="preserve"> </w:t>
-      </w:r>
-      <w:r>
-        <w:t xml:space="preserve">vs. </w:t>
-      </w:r>
-      <w:r>
-        <w:t xml:space="preserve">“What is the risk in those who were untreated?”</w:t>
-      </w:r>
-    </w:p>
-    <w:p>
-      <w:pPr>
-        <w:pStyle w:val="Compact"/>
-        <w:numPr>
-          <w:ilvl w:val="1"/>
-          <w:numId w:val="1012"/>
-        </w:numPr>
-      </w:pPr>
-      <w:r>
-        <w:t xml:space="preserve">Uses conditional risks:</w:t>
-      </w:r>
-      <w:r>
-        <w:t xml:space="preserve"> </w:t>
-      </w:r>
-      <m:oMath>
-        <m:r>
-          <m:rPr>
-            <m:sty m:val="p"/>
-          </m:rPr>
-          <m:t>Pr</m:t>
-        </m:r>
-        <m:r>
-          <m:rPr>
-            <m:sty m:val="p"/>
-          </m:rPr>
-          <m:t>[</m:t>
-        </m:r>
-        <m:r>
-          <m:t>Y</m:t>
-        </m:r>
-        <m:r>
-          <m:rPr>
-            <m:sty m:val="p"/>
-          </m:rPr>
-          <m:t>=</m:t>
-        </m:r>
-        <m:r>
-          <m:t>1</m:t>
-        </m:r>
-        <m:r>
-          <m:rPr>
-            <m:sty m:val="p"/>
-          </m:rPr>
-          <m:t>|</m:t>
-        </m:r>
-        <m:r>
-          <m:t>A</m:t>
-        </m:r>
-        <m:r>
-          <m:rPr>
-            <m:sty m:val="p"/>
-          </m:rPr>
-          <m:t>=</m:t>
-        </m:r>
-        <m:r>
-          <m:t>1</m:t>
-        </m:r>
-        <m:r>
-          <m:rPr>
-            <m:sty m:val="p"/>
-          </m:rPr>
-          <m:t>]</m:t>
-        </m:r>
-      </m:oMath>
-      <w:r>
-        <w:t xml:space="preserve"> </w:t>
-      </w:r>
-      <w:r>
-        <w:t xml:space="preserve">vs. </w:t>
-      </w:r>
-      <m:oMath>
-        <m:r>
-          <m:rPr>
-            <m:sty m:val="p"/>
-          </m:rPr>
-          <m:t>Pr</m:t>
-        </m:r>
-        <m:r>
-          <m:rPr>
-            <m:sty m:val="p"/>
-          </m:rPr>
-          <m:t>[</m:t>
-        </m:r>
-        <m:r>
-          <m:t>Y</m:t>
-        </m:r>
-        <m:r>
-          <m:rPr>
-            <m:sty m:val="p"/>
-          </m:rPr>
-          <m:t>=</m:t>
-        </m:r>
-        <m:r>
-          <m:t>1</m:t>
-        </m:r>
-        <m:r>
-          <m:rPr>
-            <m:sty m:val="p"/>
-          </m:rPr>
-          <m:t>|</m:t>
-        </m:r>
-        <m:r>
-          <m:t>A</m:t>
-        </m:r>
-        <m:r>
-          <m:rPr>
-            <m:sty m:val="p"/>
-          </m:rPr>
-          <m:t>=</m:t>
-        </m:r>
-        <m:r>
-          <m:t>0</m:t>
-        </m:r>
-        <m:r>
-          <m:rPr>
-            <m:sty m:val="p"/>
-          </m:rPr>
-          <m:t>]</m:t>
-        </m:r>
-      </m:oMath>
-    </w:p>
+    <w:tbl>
+      <w:tblPr>
+        <w:tblStyle w:val="Table"/>
+        <w:tblInd w:w="164" w:type="dxa"/>
+        <w:tblBorders>
+          <w:left w:val="single" w:sz="24" w:space="0" w:color="909090"/>
+        </w:tblBorders>
+        <w:tblCellMar>
+          <w:left w:w="0" w:type="dxa"/>
+          <w:right w:w="0" w:type="dxa"/>
+        </w:tblCellMar>
+        <w:tblLook w:firstRow="0" w:lastRow="0" w:firstColumn="0" w:lastColumn="0" w:noHBand="0" w:noVBand="0" w:val="0000"/>
+      </w:tblPr>
+      <w:tblGrid>
+        <w:gridCol w:w="7920"/>
+      </w:tblGrid>
+      <w:tr>
+        <w:trPr>
+          <w:cantSplit/>
+        </w:trPr>
+        <w:tc>
+          <w:tcPr>
+            <w:tcMar>
+              <w:left w:w="144" w:type="dxa"/>
+            </w:tcMar>
+          </w:tcPr>
+          <w:p>
+            <w:pPr>
+              <w:pStyle w:val="BodyText"/>
+            </w:pPr>
+            <w:pPr>
+              <w:spacing w:before="16" w:after="64"/>
+            </w:pPr>
+          </w:p>
+          <w:bookmarkStart w:id="34" w:name="def-causation-vs-association"/>
+          <w:p>
+            <w:pPr>
+              <w:pStyle w:val="BodyText"/>
+            </w:pPr>
+            <w:r>
+              <w:rPr>
+                <w:b/>
+                <w:bCs/>
+              </w:rPr>
+              <w:t xml:space="preserve">Definition 17 (Causation vs. Association)</w:t>
+            </w:r>
+            <w:r>
+              <w:t xml:space="preserve"> </w:t>
+            </w:r>
+            <w:r>
+              <w:t xml:space="preserve"> </w:t>
+            </w:r>
+          </w:p>
+          <w:p>
+            <w:pPr>
+              <w:pStyle w:val="Compact"/>
+              <w:numPr>
+                <w:ilvl w:val="0"/>
+                <w:numId w:val="1009"/>
+              </w:numPr>
+            </w:pPr>
+            <w:r>
+              <w:rPr>
+                <w:b/>
+                <w:bCs/>
+              </w:rPr>
+              <w:t xml:space="preserve">Causation</w:t>
+            </w:r>
+            <w:r>
+              <w:t xml:space="preserve">: Compares the</w:t>
+            </w:r>
+            <w:r>
+              <w:t xml:space="preserve"> </w:t>
+            </w:r>
+            <w:r>
+              <w:rPr>
+                <w:i/>
+                <w:iCs/>
+              </w:rPr>
+              <w:t xml:space="preserve">same</w:t>
+            </w:r>
+            <w:r>
+              <w:t xml:space="preserve"> </w:t>
+            </w:r>
+            <w:r>
+              <w:t xml:space="preserve">population under different treatment values (</w:t>
+            </w:r>
+            <w:r>
+              <w:t xml:space="preserve">“What if everyone had been treated?”</w:t>
+            </w:r>
+            <w:r>
+              <w:t xml:space="preserve"> </w:t>
+            </w:r>
+            <w:r>
+              <w:t xml:space="preserve">vs. </w:t>
+            </w:r>
+            <w:r>
+              <w:t xml:space="preserve">“What if everyone had been untreated?”</w:t>
+            </w:r>
+            <w:r>
+              <w:t xml:space="preserve">), using counterfactual risks:</w:t>
+            </w:r>
+            <w:r>
+              <w:t xml:space="preserve"> </w:t>
+            </w:r>
+            <m:oMath>
+              <m:r>
+                <m:rPr>
+                  <m:sty m:val="p"/>
+                </m:rPr>
+                <m:t>Pr</m:t>
+              </m:r>
+              <m:r>
+                <m:rPr>
+                  <m:sty m:val="p"/>
+                </m:rPr>
+                <m:t>[</m:t>
+              </m:r>
+              <m:sSup>
+                <m:e>
+                  <m:r>
+                    <m:t>Y</m:t>
+                  </m:r>
+                </m:e>
+                <m:sup>
+                  <m:r>
+                    <m:t>a</m:t>
+                  </m:r>
+                  <m:r>
+                    <m:rPr>
+                      <m:sty m:val="p"/>
+                    </m:rPr>
+                    <m:t>=</m:t>
+                  </m:r>
+                  <m:r>
+                    <m:t>1</m:t>
+                  </m:r>
+                </m:sup>
+              </m:sSup>
+              <m:r>
+                <m:rPr>
+                  <m:sty m:val="p"/>
+                </m:rPr>
+                <m:t>=</m:t>
+              </m:r>
+              <m:r>
+                <m:t>1</m:t>
+              </m:r>
+              <m:r>
+                <m:rPr>
+                  <m:sty m:val="p"/>
+                </m:rPr>
+                <m:t>]</m:t>
+              </m:r>
+            </m:oMath>
+            <w:r>
+              <w:t xml:space="preserve"> </w:t>
+            </w:r>
+            <w:r>
+              <w:t xml:space="preserve">vs. </w:t>
+            </w:r>
+            <m:oMath>
+              <m:r>
+                <m:rPr>
+                  <m:sty m:val="p"/>
+                </m:rPr>
+                <m:t>Pr</m:t>
+              </m:r>
+              <m:r>
+                <m:rPr>
+                  <m:sty m:val="p"/>
+                </m:rPr>
+                <m:t>[</m:t>
+              </m:r>
+              <m:sSup>
+                <m:e>
+                  <m:r>
+                    <m:t>Y</m:t>
+                  </m:r>
+                </m:e>
+                <m:sup>
+                  <m:r>
+                    <m:t>a</m:t>
+                  </m:r>
+                  <m:r>
+                    <m:rPr>
+                      <m:sty m:val="p"/>
+                    </m:rPr>
+                    <m:t>=</m:t>
+                  </m:r>
+                  <m:r>
+                    <m:t>0</m:t>
+                  </m:r>
+                </m:sup>
+              </m:sSup>
+              <m:r>
+                <m:rPr>
+                  <m:sty m:val="p"/>
+                </m:rPr>
+                <m:t>=</m:t>
+              </m:r>
+              <m:r>
+                <m:t>1</m:t>
+              </m:r>
+              <m:r>
+                <m:rPr>
+                  <m:sty m:val="p"/>
+                </m:rPr>
+                <m:t>]</m:t>
+              </m:r>
+            </m:oMath>
+            <w:r>
+              <w:t xml:space="preserve">.</w:t>
+            </w:r>
+          </w:p>
+          <w:p>
+            <w:pPr>
+              <w:pStyle w:val="Compact"/>
+              <w:numPr>
+                <w:ilvl w:val="0"/>
+                <w:numId w:val="1009"/>
+              </w:numPr>
+            </w:pPr>
+            <w:r>
+              <w:rPr>
+                <w:b/>
+                <w:bCs/>
+              </w:rPr>
+              <w:t xml:space="preserve">Association</w:t>
+            </w:r>
+            <w:r>
+              <w:t xml:space="preserve">: Compares</w:t>
+            </w:r>
+            <w:r>
+              <w:t xml:space="preserve"> </w:t>
+            </w:r>
+            <w:r>
+              <w:rPr>
+                <w:i/>
+                <w:iCs/>
+              </w:rPr>
+              <w:t xml:space="preserve">different subsets</w:t>
+            </w:r>
+            <w:r>
+              <w:t xml:space="preserve"> </w:t>
+            </w:r>
+            <w:r>
+              <w:t xml:space="preserve">of the population (</w:t>
+            </w:r>
+            <w:r>
+              <w:t xml:space="preserve">“What is the risk in those who were treated?”</w:t>
+            </w:r>
+            <w:r>
+              <w:t xml:space="preserve"> </w:t>
+            </w:r>
+            <w:r>
+              <w:t xml:space="preserve">vs. </w:t>
+            </w:r>
+            <w:r>
+              <w:t xml:space="preserve">“What is the risk in those who were untreated?”</w:t>
+            </w:r>
+            <w:r>
+              <w:t xml:space="preserve">), using conditional risks:</w:t>
+            </w:r>
+            <w:r>
+              <w:t xml:space="preserve"> </w:t>
+            </w:r>
+            <m:oMath>
+              <m:r>
+                <m:rPr>
+                  <m:sty m:val="p"/>
+                </m:rPr>
+                <m:t>Pr</m:t>
+              </m:r>
+              <m:r>
+                <m:rPr>
+                  <m:sty m:val="p"/>
+                </m:rPr>
+                <m:t>[</m:t>
+              </m:r>
+              <m:r>
+                <m:t>Y</m:t>
+              </m:r>
+              <m:r>
+                <m:rPr>
+                  <m:sty m:val="p"/>
+                </m:rPr>
+                <m:t>=</m:t>
+              </m:r>
+              <m:r>
+                <m:t>1</m:t>
+              </m:r>
+              <m:r>
+                <m:rPr>
+                  <m:sty m:val="p"/>
+                </m:rPr>
+                <m:t>|</m:t>
+              </m:r>
+              <m:r>
+                <m:t>A</m:t>
+              </m:r>
+              <m:r>
+                <m:rPr>
+                  <m:sty m:val="p"/>
+                </m:rPr>
+                <m:t>=</m:t>
+              </m:r>
+              <m:r>
+                <m:t>1</m:t>
+              </m:r>
+              <m:r>
+                <m:rPr>
+                  <m:sty m:val="p"/>
+                </m:rPr>
+                <m:t>]</m:t>
+              </m:r>
+            </m:oMath>
+            <w:r>
+              <w:t xml:space="preserve"> </w:t>
+            </w:r>
+            <w:r>
+              <w:t xml:space="preserve">vs. </w:t>
+            </w:r>
+            <m:oMath>
+              <m:r>
+                <m:rPr>
+                  <m:sty m:val="p"/>
+                </m:rPr>
+                <m:t>Pr</m:t>
+              </m:r>
+              <m:r>
+                <m:rPr>
+                  <m:sty m:val="p"/>
+                </m:rPr>
+                <m:t>[</m:t>
+              </m:r>
+              <m:r>
+                <m:t>Y</m:t>
+              </m:r>
+              <m:r>
+                <m:rPr>
+                  <m:sty m:val="p"/>
+                </m:rPr>
+                <m:t>=</m:t>
+              </m:r>
+              <m:r>
+                <m:t>1</m:t>
+              </m:r>
+              <m:r>
+                <m:rPr>
+                  <m:sty m:val="p"/>
+                </m:rPr>
+                <m:t>|</m:t>
+              </m:r>
+              <m:r>
+                <m:t>A</m:t>
+              </m:r>
+              <m:r>
+                <m:rPr>
+                  <m:sty m:val="p"/>
+                </m:rPr>
+                <m:t>=</m:t>
+              </m:r>
+              <m:r>
+                <m:t>0</m:t>
+              </m:r>
+              <m:r>
+                <m:rPr>
+                  <m:sty m:val="p"/>
+                </m:rPr>
+                <m:t>]</m:t>
+              </m:r>
+            </m:oMath>
+            <w:r>
+              <w:t xml:space="preserve">.</w:t>
+            </w:r>
+          </w:p>
+          <w:bookmarkEnd w:id="34"/>
+        </w:tc>
+      </w:tr>
+    </w:tbl>
     <w:p>
       <w:pPr>
         <w:pStyle w:val="FirstParagraph"/>
@@ -5333,8 +6014,8 @@
         <w:t xml:space="preserve">(discussed in Chapter 7).</w:t>
       </w:r>
     </w:p>
-    <w:bookmarkEnd w:id="26"/>
-    <w:bookmarkStart w:id="27" w:name="the-challenge-of-causal-inference"/>
+    <w:bookmarkEnd w:id="35"/>
+    <w:bookmarkStart w:id="36" w:name="the-challenge-of-causal-inference"/>
     <w:p>
       <w:pPr>
         <w:pStyle w:val="Heading3"/>
@@ -5359,9 +6040,9 @@
         <w:t xml:space="preserve">Chapter 2 provides one answer: conduct a randomized experiment.</w:t>
       </w:r>
     </w:p>
-    <w:bookmarkEnd w:id="27"/>
-    <w:bookmarkEnd w:id="28"/>
-    <w:bookmarkStart w:id="29" w:name="summary"/>
+    <w:bookmarkEnd w:id="36"/>
+    <w:bookmarkEnd w:id="37"/>
+    <w:bookmarkStart w:id="38" w:name="summary"/>
     <w:p>
       <w:pPr>
         <w:pStyle w:val="Heading2"/>
@@ -5389,7 +6070,7 @@
       <w:pPr>
         <w:numPr>
           <w:ilvl w:val="0"/>
-          <w:numId w:val="1013"/>
+          <w:numId w:val="1010"/>
         </w:numPr>
       </w:pPr>
       <w:r>
@@ -5463,7 +6144,7 @@
       <w:pPr>
         <w:numPr>
           <w:ilvl w:val="0"/>
-          <w:numId w:val="1013"/>
+          <w:numId w:val="1010"/>
         </w:numPr>
       </w:pPr>
       <w:r>
@@ -5571,7 +6252,7 @@
       <w:pPr>
         <w:numPr>
           <w:ilvl w:val="0"/>
-          <w:numId w:val="1013"/>
+          <w:numId w:val="1010"/>
         </w:numPr>
       </w:pPr>
       <w:r>
@@ -5589,7 +6270,7 @@
       <w:pPr>
         <w:numPr>
           <w:ilvl w:val="0"/>
-          <w:numId w:val="1013"/>
+          <w:numId w:val="1010"/>
         </w:numPr>
       </w:pPr>
       <w:r>
@@ -5607,7 +6288,7 @@
       <w:pPr>
         <w:numPr>
           <w:ilvl w:val="0"/>
-          <w:numId w:val="1013"/>
+          <w:numId w:val="1010"/>
         </w:numPr>
       </w:pPr>
       <w:r>
@@ -5629,8 +6310,8 @@
         <w:t xml:space="preserve">The key insight: Association does not imply causation. The challenge is to use observed associations to make valid causal inferences.</w:t>
       </w:r>
     </w:p>
-    <w:bookmarkEnd w:id="29"/>
-    <w:bookmarkStart w:id="33" w:name="references"/>
+    <w:bookmarkEnd w:id="38"/>
+    <w:bookmarkStart w:id="42" w:name="references"/>
     <w:p>
       <w:pPr>
         <w:pStyle w:val="Heading2"/>
@@ -5646,8 +6327,8 @@
         </w:pict>
       </w:r>
     </w:p>
-    <w:bookmarkStart w:id="32" w:name="refs"/>
-    <w:bookmarkStart w:id="31" w:name="ref-hernan2020causal"/>
+    <w:bookmarkStart w:id="41" w:name="refs"/>
+    <w:bookmarkStart w:id="40" w:name="ref-hernan2020causal"/>
     <w:p>
       <w:pPr>
         <w:pStyle w:val="Bibliography"/>
@@ -5671,7 +6352,7 @@
       <w:r>
         <w:t xml:space="preserve"> </w:t>
       </w:r>
-      <w:hyperlink r:id="rId30">
+      <w:hyperlink r:id="rId39">
         <w:r>
           <w:rPr>
             <w:rStyle w:val="Hyperlink"/>
@@ -5683,9 +6364,9 @@
         <w:t xml:space="preserve">.</w:t>
       </w:r>
     </w:p>
-    <w:bookmarkEnd w:id="31"/>
-    <w:bookmarkEnd w:id="32"/>
-    <w:bookmarkEnd w:id="33"/>
+    <w:bookmarkEnd w:id="40"/>
+    <w:bookmarkEnd w:id="41"/>
+    <w:bookmarkEnd w:id="42"/>
     <w:sectPr>
       <w:footnotePr>
         <w:numRestart w:val="eachSect"/>
@@ -6000,67 +6681,13 @@
     <w:abstractNumId w:val="991"/>
   </w:num>
   <w:num w:numId="1005">
-    <w:abstractNumId w:val="99411"/>
-    <w:lvlOverride w:ilvl="0">
-      <w:startOverride w:val="1"/>
-    </w:lvlOverride>
-    <w:lvlOverride w:ilvl="1">
-      <w:startOverride w:val="1"/>
-    </w:lvlOverride>
-    <w:lvlOverride w:ilvl="2">
-      <w:startOverride w:val="1"/>
-    </w:lvlOverride>
-    <w:lvlOverride w:ilvl="3">
-      <w:startOverride w:val="1"/>
-    </w:lvlOverride>
-    <w:lvlOverride w:ilvl="4">
-      <w:startOverride w:val="1"/>
-    </w:lvlOverride>
-    <w:lvlOverride w:ilvl="5">
-      <w:startOverride w:val="1"/>
-    </w:lvlOverride>
-    <w:lvlOverride w:ilvl="6">
-      <w:startOverride w:val="1"/>
-    </w:lvlOverride>
-    <w:lvlOverride w:ilvl="7">
-      <w:startOverride w:val="1"/>
-    </w:lvlOverride>
-    <w:lvlOverride w:ilvl="8">
-      <w:startOverride w:val="1"/>
-    </w:lvlOverride>
+    <w:abstractNumId w:val="991"/>
   </w:num>
   <w:num w:numId="1006">
     <w:abstractNumId w:val="991"/>
   </w:num>
   <w:num w:numId="1007">
-    <w:abstractNumId w:val="99411"/>
-    <w:lvlOverride w:ilvl="0">
-      <w:startOverride w:val="1"/>
-    </w:lvlOverride>
-    <w:lvlOverride w:ilvl="1">
-      <w:startOverride w:val="1"/>
-    </w:lvlOverride>
-    <w:lvlOverride w:ilvl="2">
-      <w:startOverride w:val="1"/>
-    </w:lvlOverride>
-    <w:lvlOverride w:ilvl="3">
-      <w:startOverride w:val="1"/>
-    </w:lvlOverride>
-    <w:lvlOverride w:ilvl="4">
-      <w:startOverride w:val="1"/>
-    </w:lvlOverride>
-    <w:lvlOverride w:ilvl="5">
-      <w:startOverride w:val="1"/>
-    </w:lvlOverride>
-    <w:lvlOverride w:ilvl="6">
-      <w:startOverride w:val="1"/>
-    </w:lvlOverride>
-    <w:lvlOverride w:ilvl="7">
-      <w:startOverride w:val="1"/>
-    </w:lvlOverride>
-    <w:lvlOverride w:ilvl="8">
-      <w:startOverride w:val="1"/>
-    </w:lvlOverride>
+    <w:abstractNumId w:val="991"/>
   </w:num>
   <w:num w:numId="1008">
     <w:abstractNumId w:val="991"/>
@@ -6069,15 +6696,6 @@
     <w:abstractNumId w:val="991"/>
   </w:num>
   <w:num w:numId="1010">
-    <w:abstractNumId w:val="991"/>
-  </w:num>
-  <w:num w:numId="1011">
-    <w:abstractNumId w:val="991"/>
-  </w:num>
-  <w:num w:numId="1012">
-    <w:abstractNumId w:val="991"/>
-  </w:num>
-  <w:num w:numId="1013">
     <w:abstractNumId w:val="99411"/>
     <w:lvlOverride w:ilvl="0">
       <w:startOverride w:val="1"/>

</xml_diff>